<commit_message>
Spatial categories: pipelines Transcriptomics / Spatial_Transcriptomics, svf modules Omics / Spatial_Analysis
Co-Authored-By: Claude Opus 5.5 <noreply@anthropic.com>
</commit_message>
<xml_diff>
--- a/docs/Spatial_Transcriptomics_Visium_HD_Pipeline/modules/Portal_Content.docx
+++ b/docs/Spatial_Transcriptomics_Visium_HD_Pipeline/modules/Portal_Content.docx
@@ -266,7 +266,7 @@
         <w:t xml:space="preserve">docs/CLOSHA_Portal_Guide_v1.md</w:t>
       </w:r>
       <w:r>
-        <w:t xml:space="preserve"> 5.2). 공간 전사체 군집은 기존 목록에 맞는 중분류가 없어 Omics / Clustering(신규)을 제안합니다. 단일세포 RNA-seq 군집 모듈도 담을 수 있는 일반 이름입니다.</w:t>
+        <w:t xml:space="preserve"> 5.2). 공간 전사체 군집은 기존 목록에 맞는 중분류가 없어 Omics / Clustering(신규)을 제안합니다. 공간 가변 유전자 모듈은 정량이 아니라 공간 통계 분석이라 Omics / Spatial_Analysis(신규)를 제안합니다. 공간 영역 탐지나 이웃 분석 같은 다른 공간 모듈도 담을 수 있는 이름입니다. 단일세포 RNA-seq 군집 모듈도 담을 수 있는 일반 이름입니다.</w:t>
       </w:r>
     </w:p>
     <w:p>
@@ -10894,27 +10894,27 @@
                 <w:sz w:val="18"/>
                 <w:szCs w:val="18"/>
               </w:rPr>
-              <w:t xml:space="preserve">Expression_Quantification</w:t>
-            </w:r>
-          </w:p>
-        </w:tc>
-        <w:tc>
-          <w:tcPr>
-            <w:tcW w:type="dxa" w:w="3853"/>
-            <w:tcMar>
-              <w:top w:type="dxa" w:w="60"/>
-              <w:left w:type="dxa" w:w="90"/>
-              <w:bottom w:type="dxa" w:w="60"/>
-              <w:right w:type="dxa" w:w="90"/>
-            </w:tcMar>
-          </w:tcPr>
-          <w:p>
-            <w:r>
-              <w:rPr>
-                <w:sz w:val="18"/>
-                <w:szCs w:val="18"/>
-              </w:rPr>
-              <w:t xml:space="preserve">Expression_Quantification</w:t>
+              <w:t xml:space="preserve">Spatial_Analysis (신규)</w:t>
+            </w:r>
+          </w:p>
+        </w:tc>
+        <w:tc>
+          <w:tcPr>
+            <w:tcW w:type="dxa" w:w="3853"/>
+            <w:tcMar>
+              <w:top w:type="dxa" w:w="60"/>
+              <w:left w:type="dxa" w:w="90"/>
+              <w:bottom w:type="dxa" w:w="60"/>
+              <w:right w:type="dxa" w:w="90"/>
+            </w:tcMar>
+          </w:tcPr>
+          <w:p>
+            <w:r>
+              <w:rPr>
+                <w:sz w:val="18"/>
+                <w:szCs w:val="18"/>
+              </w:rPr>
+              <w:t xml:space="preserve">Spatial_Analysis (new)</w:t>
             </w:r>
           </w:p>
         </w:tc>

</xml_diff>

<commit_message>
Spatial module categories: new top level Single_Cell_and_Spatial; guide allows new categories
Co-Authored-By: Claude Opus 5.5 <noreply@anthropic.com>
</commit_message>
<xml_diff>
--- a/docs/Spatial_Transcriptomics_Visium_HD_Pipeline/modules/Portal_Content.docx
+++ b/docs/Spatial_Transcriptomics_Visium_HD_Pipeline/modules/Portal_Content.docx
@@ -260,13 +260,7 @@
         <w:spacing w:after="80"/>
       </w:pPr>
       <w:r>
-        <w:t xml:space="preserve">카테고리는 기능(분석 단계) 기준의 대분류·중분류로 정했습니다(</w:t>
-      </w:r>
-      <w:r>
-        <w:t xml:space="preserve">docs/CLOSHA_Portal_Guide_v1.md</w:t>
-      </w:r>
-      <w:r>
-        <w:t xml:space="preserve"> 5.2). 공간 전사체 군집은 기존 목록에 맞는 중분류가 없어 Omics / Clustering(신규)을 제안합니다. 공간 가변 유전자 모듈은 정량이 아니라 공간 통계 분석이라 Omics / Spatial_Analysis(신규)를 제안합니다. 공간 영역 탐지나 이웃 분석 같은 다른 공간 모듈도 담을 수 있는 이름입니다. 단일세포 RNA-seq 군집 모듈도 담을 수 있는 일반 이름입니다.</w:t>
+        <w:t xml:space="preserve">카테고리는 대분류 Single_Cell_and_Spatial(신규) 아래 분석 단계별 중분류로 정했습니다(사용자 결정, 2026-10-27). 기존 대분류(Omics 등)는 공간 전사체에 맞지 않아 새로 만들었고, 단일세포 RNA-seq 모듈도 같은 흐름(전처리, 군집, 세포 유형, 조건 비교)이라 함께 담을 수 있게 이름을 지었습니다. 중분류: Preprocessing(불러오기·정규화), Clustering(군집·통합), Spatial_Statistics(공간 가변 유전자), Differential_Expression(조건 비교), Cell_Type_Annotation(세포 유형), Reference_Check(참조 확인).</w:t>
       </w:r>
     </w:p>
     <w:p>
@@ -280,19 +274,6 @@
       </w:pPr>
       <w:r>
         <w:t xml:space="preserve">버전은 배포 번호입니다. CLOSHA 2.0 모듈은 2.0 번호 + 1(이번에 모두 스크립트 규칙에 맞춰 고쳐 1.1)이고, 3.0에서 새로 만든 모듈은 1.0입니다.</w:t>
-      </w:r>
-    </w:p>
-    <w:p>
-      <w:pPr>
-        <w:pStyle w:val="ListParagraph"/>
-        <w:numPr>
-          <w:ilvl w:val="0"/>
-          <w:numId w:val="2"/>
-        </w:numPr>
-        <w:spacing w:after="80"/>
-      </w:pPr>
-      <w:r>
-        <w:t xml:space="preserve">세포 유형 모듈(spatial_labelTransfer, spatial_rctd, spatial_hd_rctd)은 기존 목록에 맞는 중분류가 없어 Annotation / Cell_Type_Annotation(신규)을 제안합니다. 단일세포 RNA-seq 세포 유형 모듈도 담을 수 있는 일반 이름입니다. check_reference는 참조 자료를 살피는 보조 도구라 Utility / Genomic_data_Utility에 둡니다.</w:t>
       </w:r>
     </w:p>
     <w:p>
@@ -635,27 +616,27 @@
                 <w:sz w:val="18"/>
                 <w:szCs w:val="18"/>
               </w:rPr>
-              <w:t xml:space="preserve">Omics</w:t>
-            </w:r>
-          </w:p>
-        </w:tc>
-        <w:tc>
-          <w:tcPr>
-            <w:tcW w:type="dxa" w:w="3853"/>
-            <w:tcMar>
-              <w:top w:type="dxa" w:w="60"/>
-              <w:left w:type="dxa" w:w="90"/>
-              <w:bottom w:type="dxa" w:w="60"/>
-              <w:right w:type="dxa" w:w="90"/>
-            </w:tcMar>
-          </w:tcPr>
-          <w:p>
-            <w:r>
-              <w:rPr>
-                <w:sz w:val="18"/>
-                <w:szCs w:val="18"/>
-              </w:rPr>
-              <w:t xml:space="preserve">Omics</w:t>
+              <w:t xml:space="preserve">Single_Cell_and_Spatial (신규)</w:t>
+            </w:r>
+          </w:p>
+        </w:tc>
+        <w:tc>
+          <w:tcPr>
+            <w:tcW w:type="dxa" w:w="3853"/>
+            <w:tcMar>
+              <w:top w:type="dxa" w:w="60"/>
+              <w:left w:type="dxa" w:w="90"/>
+              <w:bottom w:type="dxa" w:w="60"/>
+              <w:right w:type="dxa" w:w="90"/>
+            </w:tcMar>
+          </w:tcPr>
+          <w:p>
+            <w:r>
+              <w:rPr>
+                <w:sz w:val="18"/>
+                <w:szCs w:val="18"/>
+              </w:rPr>
+              <w:t xml:space="preserve">Single_Cell_and_Spatial (new)</w:t>
             </w:r>
           </w:p>
         </w:tc>
@@ -697,27 +678,27 @@
                 <w:sz w:val="18"/>
                 <w:szCs w:val="18"/>
               </w:rPr>
-              <w:t xml:space="preserve">Expression_Quantification</w:t>
-            </w:r>
-          </w:p>
-        </w:tc>
-        <w:tc>
-          <w:tcPr>
-            <w:tcW w:type="dxa" w:w="3853"/>
-            <w:tcMar>
-              <w:top w:type="dxa" w:w="60"/>
-              <w:left w:type="dxa" w:w="90"/>
-              <w:bottom w:type="dxa" w:w="60"/>
-              <w:right w:type="dxa" w:w="90"/>
-            </w:tcMar>
-          </w:tcPr>
-          <w:p>
-            <w:r>
-              <w:rPr>
-                <w:sz w:val="18"/>
-                <w:szCs w:val="18"/>
-              </w:rPr>
-              <w:t xml:space="preserve">Expression_Quantification</w:t>
+              <w:t xml:space="preserve">Preprocessing (신규)</w:t>
+            </w:r>
+          </w:p>
+        </w:tc>
+        <w:tc>
+          <w:tcPr>
+            <w:tcW w:type="dxa" w:w="3853"/>
+            <w:tcMar>
+              <w:top w:type="dxa" w:w="60"/>
+              <w:left w:type="dxa" w:w="90"/>
+              <w:bottom w:type="dxa" w:w="60"/>
+              <w:right w:type="dxa" w:w="90"/>
+            </w:tcMar>
+          </w:tcPr>
+          <w:p>
+            <w:r>
+              <w:rPr>
+                <w:sz w:val="18"/>
+                <w:szCs w:val="18"/>
+              </w:rPr>
+              <w:t xml:space="preserve">Preprocessing (new)</w:t>
             </w:r>
           </w:p>
         </w:tc>
@@ -5200,27 +5181,27 @@
                 <w:sz w:val="18"/>
                 <w:szCs w:val="18"/>
               </w:rPr>
-              <w:t xml:space="preserve">Omics</w:t>
-            </w:r>
-          </w:p>
-        </w:tc>
-        <w:tc>
-          <w:tcPr>
-            <w:tcW w:type="dxa" w:w="3853"/>
-            <w:tcMar>
-              <w:top w:type="dxa" w:w="60"/>
-              <w:left w:type="dxa" w:w="90"/>
-              <w:bottom w:type="dxa" w:w="60"/>
-              <w:right w:type="dxa" w:w="90"/>
-            </w:tcMar>
-          </w:tcPr>
-          <w:p>
-            <w:r>
-              <w:rPr>
-                <w:sz w:val="18"/>
-                <w:szCs w:val="18"/>
-              </w:rPr>
-              <w:t xml:space="preserve">Omics</w:t>
+              <w:t xml:space="preserve">Single_Cell_and_Spatial (신규)</w:t>
+            </w:r>
+          </w:p>
+        </w:tc>
+        <w:tc>
+          <w:tcPr>
+            <w:tcW w:type="dxa" w:w="3853"/>
+            <w:tcMar>
+              <w:top w:type="dxa" w:w="60"/>
+              <w:left w:type="dxa" w:w="90"/>
+              <w:bottom w:type="dxa" w:w="60"/>
+              <w:right w:type="dxa" w:w="90"/>
+            </w:tcMar>
+          </w:tcPr>
+          <w:p>
+            <w:r>
+              <w:rPr>
+                <w:sz w:val="18"/>
+                <w:szCs w:val="18"/>
+              </w:rPr>
+              <w:t xml:space="preserve">Single_Cell_and_Spatial (new)</w:t>
             </w:r>
           </w:p>
         </w:tc>
@@ -10832,27 +10813,27 @@
                 <w:sz w:val="18"/>
                 <w:szCs w:val="18"/>
               </w:rPr>
-              <w:t xml:space="preserve">Omics</w:t>
-            </w:r>
-          </w:p>
-        </w:tc>
-        <w:tc>
-          <w:tcPr>
-            <w:tcW w:type="dxa" w:w="3853"/>
-            <w:tcMar>
-              <w:top w:type="dxa" w:w="60"/>
-              <w:left w:type="dxa" w:w="90"/>
-              <w:bottom w:type="dxa" w:w="60"/>
-              <w:right w:type="dxa" w:w="90"/>
-            </w:tcMar>
-          </w:tcPr>
-          <w:p>
-            <w:r>
-              <w:rPr>
-                <w:sz w:val="18"/>
-                <w:szCs w:val="18"/>
-              </w:rPr>
-              <w:t xml:space="preserve">Omics</w:t>
+              <w:t xml:space="preserve">Single_Cell_and_Spatial (신규)</w:t>
+            </w:r>
+          </w:p>
+        </w:tc>
+        <w:tc>
+          <w:tcPr>
+            <w:tcW w:type="dxa" w:w="3853"/>
+            <w:tcMar>
+              <w:top w:type="dxa" w:w="60"/>
+              <w:left w:type="dxa" w:w="90"/>
+              <w:bottom w:type="dxa" w:w="60"/>
+              <w:right w:type="dxa" w:w="90"/>
+            </w:tcMar>
+          </w:tcPr>
+          <w:p>
+            <w:r>
+              <w:rPr>
+                <w:sz w:val="18"/>
+                <w:szCs w:val="18"/>
+              </w:rPr>
+              <w:t xml:space="preserve">Single_Cell_and_Spatial (new)</w:t>
             </w:r>
           </w:p>
         </w:tc>
@@ -10894,27 +10875,27 @@
                 <w:sz w:val="18"/>
                 <w:szCs w:val="18"/>
               </w:rPr>
-              <w:t xml:space="preserve">Spatial_Analysis (신규)</w:t>
-            </w:r>
-          </w:p>
-        </w:tc>
-        <w:tc>
-          <w:tcPr>
-            <w:tcW w:type="dxa" w:w="3853"/>
-            <w:tcMar>
-              <w:top w:type="dxa" w:w="60"/>
-              <w:left w:type="dxa" w:w="90"/>
-              <w:bottom w:type="dxa" w:w="60"/>
-              <w:right w:type="dxa" w:w="90"/>
-            </w:tcMar>
-          </w:tcPr>
-          <w:p>
-            <w:r>
-              <w:rPr>
-                <w:sz w:val="18"/>
-                <w:szCs w:val="18"/>
-              </w:rPr>
-              <w:t xml:space="preserve">Spatial_Analysis (new)</w:t>
+              <w:t xml:space="preserve">Spatial_Statistics (신규)</w:t>
+            </w:r>
+          </w:p>
+        </w:tc>
+        <w:tc>
+          <w:tcPr>
+            <w:tcW w:type="dxa" w:w="3853"/>
+            <w:tcMar>
+              <w:top w:type="dxa" w:w="60"/>
+              <w:left w:type="dxa" w:w="90"/>
+              <w:bottom w:type="dxa" w:w="60"/>
+              <w:right w:type="dxa" w:w="90"/>
+            </w:tcMar>
+          </w:tcPr>
+          <w:p>
+            <w:r>
+              <w:rPr>
+                <w:sz w:val="18"/>
+                <w:szCs w:val="18"/>
+              </w:rPr>
+              <w:t xml:space="preserve">Spatial_Statistics (new)</w:t>
             </w:r>
           </w:p>
         </w:tc>
@@ -14867,27 +14848,27 @@
                 <w:sz w:val="18"/>
                 <w:szCs w:val="18"/>
               </w:rPr>
-              <w:t xml:space="preserve">Omics</w:t>
-            </w:r>
-          </w:p>
-        </w:tc>
-        <w:tc>
-          <w:tcPr>
-            <w:tcW w:type="dxa" w:w="3853"/>
-            <w:tcMar>
-              <w:top w:type="dxa" w:w="60"/>
-              <w:left w:type="dxa" w:w="90"/>
-              <w:bottom w:type="dxa" w:w="60"/>
-              <w:right w:type="dxa" w:w="90"/>
-            </w:tcMar>
-          </w:tcPr>
-          <w:p>
-            <w:r>
-              <w:rPr>
-                <w:sz w:val="18"/>
-                <w:szCs w:val="18"/>
-              </w:rPr>
-              <w:t xml:space="preserve">Omics</w:t>
+              <w:t xml:space="preserve">Single_Cell_and_Spatial (신규)</w:t>
+            </w:r>
+          </w:p>
+        </w:tc>
+        <w:tc>
+          <w:tcPr>
+            <w:tcW w:type="dxa" w:w="3853"/>
+            <w:tcMar>
+              <w:top w:type="dxa" w:w="60"/>
+              <w:left w:type="dxa" w:w="90"/>
+              <w:bottom w:type="dxa" w:w="60"/>
+              <w:right w:type="dxa" w:w="90"/>
+            </w:tcMar>
+          </w:tcPr>
+          <w:p>
+            <w:r>
+              <w:rPr>
+                <w:sz w:val="18"/>
+                <w:szCs w:val="18"/>
+              </w:rPr>
+              <w:t xml:space="preserve">Single_Cell_and_Spatial (new)</w:t>
             </w:r>
           </w:p>
         </w:tc>
@@ -14929,27 +14910,27 @@
                 <w:sz w:val="18"/>
                 <w:szCs w:val="18"/>
               </w:rPr>
-              <w:t xml:space="preserve">Differential_Analysis</w:t>
-            </w:r>
-          </w:p>
-        </w:tc>
-        <w:tc>
-          <w:tcPr>
-            <w:tcW w:type="dxa" w:w="3853"/>
-            <w:tcMar>
-              <w:top w:type="dxa" w:w="60"/>
-              <w:left w:type="dxa" w:w="90"/>
-              <w:bottom w:type="dxa" w:w="60"/>
-              <w:right w:type="dxa" w:w="90"/>
-            </w:tcMar>
-          </w:tcPr>
-          <w:p>
-            <w:r>
-              <w:rPr>
-                <w:sz w:val="18"/>
-                <w:szCs w:val="18"/>
-              </w:rPr>
-              <w:t xml:space="preserve">Differential_Analysis</w:t>
+              <w:t xml:space="preserve">Differential_Expression (신규)</w:t>
+            </w:r>
+          </w:p>
+        </w:tc>
+        <w:tc>
+          <w:tcPr>
+            <w:tcW w:type="dxa" w:w="3853"/>
+            <w:tcMar>
+              <w:top w:type="dxa" w:w="60"/>
+              <w:left w:type="dxa" w:w="90"/>
+              <w:bottom w:type="dxa" w:w="60"/>
+              <w:right w:type="dxa" w:w="90"/>
+            </w:tcMar>
+          </w:tcPr>
+          <w:p>
+            <w:r>
+              <w:rPr>
+                <w:sz w:val="18"/>
+                <w:szCs w:val="18"/>
+              </w:rPr>
+              <w:t xml:space="preserve">Differential_Expression (new)</w:t>
             </w:r>
           </w:p>
         </w:tc>
@@ -20650,27 +20631,27 @@
                 <w:sz w:val="18"/>
                 <w:szCs w:val="18"/>
               </w:rPr>
-              <w:t xml:space="preserve">Annotation</w:t>
-            </w:r>
-          </w:p>
-        </w:tc>
-        <w:tc>
-          <w:tcPr>
-            <w:tcW w:type="dxa" w:w="3853"/>
-            <w:tcMar>
-              <w:top w:type="dxa" w:w="60"/>
-              <w:left w:type="dxa" w:w="90"/>
-              <w:bottom w:type="dxa" w:w="60"/>
-              <w:right w:type="dxa" w:w="90"/>
-            </w:tcMar>
-          </w:tcPr>
-          <w:p>
-            <w:r>
-              <w:rPr>
-                <w:sz w:val="18"/>
-                <w:szCs w:val="18"/>
-              </w:rPr>
-              <w:t xml:space="preserve">Annotation</w:t>
+              <w:t xml:space="preserve">Single_Cell_and_Spatial (신규)</w:t>
+            </w:r>
+          </w:p>
+        </w:tc>
+        <w:tc>
+          <w:tcPr>
+            <w:tcW w:type="dxa" w:w="3853"/>
+            <w:tcMar>
+              <w:top w:type="dxa" w:w="60"/>
+              <w:left w:type="dxa" w:w="90"/>
+              <w:bottom w:type="dxa" w:w="60"/>
+              <w:right w:type="dxa" w:w="90"/>
+            </w:tcMar>
+          </w:tcPr>
+          <w:p>
+            <w:r>
+              <w:rPr>
+                <w:sz w:val="18"/>
+                <w:szCs w:val="18"/>
+              </w:rPr>
+              <w:t xml:space="preserve">Single_Cell_and_Spatial (new)</w:t>
             </w:r>
           </w:p>
         </w:tc>
@@ -25432,27 +25413,27 @@
                 <w:sz w:val="18"/>
                 <w:szCs w:val="18"/>
               </w:rPr>
-              <w:t xml:space="preserve">Utility</w:t>
-            </w:r>
-          </w:p>
-        </w:tc>
-        <w:tc>
-          <w:tcPr>
-            <w:tcW w:type="dxa" w:w="3853"/>
-            <w:tcMar>
-              <w:top w:type="dxa" w:w="60"/>
-              <w:left w:type="dxa" w:w="90"/>
-              <w:bottom w:type="dxa" w:w="60"/>
-              <w:right w:type="dxa" w:w="90"/>
-            </w:tcMar>
-          </w:tcPr>
-          <w:p>
-            <w:r>
-              <w:rPr>
-                <w:sz w:val="18"/>
-                <w:szCs w:val="18"/>
-              </w:rPr>
-              <w:t xml:space="preserve">Utility</w:t>
+              <w:t xml:space="preserve">Single_Cell_and_Spatial (신규)</w:t>
+            </w:r>
+          </w:p>
+        </w:tc>
+        <w:tc>
+          <w:tcPr>
+            <w:tcW w:type="dxa" w:w="3853"/>
+            <w:tcMar>
+              <w:top w:type="dxa" w:w="60"/>
+              <w:left w:type="dxa" w:w="90"/>
+              <w:bottom w:type="dxa" w:w="60"/>
+              <w:right w:type="dxa" w:w="90"/>
+            </w:tcMar>
+          </w:tcPr>
+          <w:p>
+            <w:r>
+              <w:rPr>
+                <w:sz w:val="18"/>
+                <w:szCs w:val="18"/>
+              </w:rPr>
+              <w:t xml:space="preserve">Single_Cell_and_Spatial (new)</w:t>
             </w:r>
           </w:p>
         </w:tc>
@@ -25494,27 +25475,27 @@
                 <w:sz w:val="18"/>
                 <w:szCs w:val="18"/>
               </w:rPr>
-              <w:t xml:space="preserve">Genomic_data_Utility</w:t>
-            </w:r>
-          </w:p>
-        </w:tc>
-        <w:tc>
-          <w:tcPr>
-            <w:tcW w:type="dxa" w:w="3853"/>
-            <w:tcMar>
-              <w:top w:type="dxa" w:w="60"/>
-              <w:left w:type="dxa" w:w="90"/>
-              <w:bottom w:type="dxa" w:w="60"/>
-              <w:right w:type="dxa" w:w="90"/>
-            </w:tcMar>
-          </w:tcPr>
-          <w:p>
-            <w:r>
-              <w:rPr>
-                <w:sz w:val="18"/>
-                <w:szCs w:val="18"/>
-              </w:rPr>
-              <w:t xml:space="preserve">Genomic_data_Utility</w:t>
+              <w:t xml:space="preserve">Reference_Check (신규)</w:t>
+            </w:r>
+          </w:p>
+        </w:tc>
+        <w:tc>
+          <w:tcPr>
+            <w:tcW w:type="dxa" w:w="3853"/>
+            <w:tcMar>
+              <w:top w:type="dxa" w:w="60"/>
+              <w:left w:type="dxa" w:w="90"/>
+              <w:bottom w:type="dxa" w:w="60"/>
+              <w:right w:type="dxa" w:w="90"/>
+            </w:tcMar>
+          </w:tcPr>
+          <w:p>
+            <w:r>
+              <w:rPr>
+                <w:sz w:val="18"/>
+                <w:szCs w:val="18"/>
+              </w:rPr>
+              <w:t xml:space="preserve">Reference_Check (new)</w:t>
             </w:r>
           </w:p>
         </w:tc>

</xml_diff>

<commit_message>
Spatial module categories by function: Gene_Expression (new), Annotation / Cell_Type_Annotation, Utility
Replaces the data-type top level Single_Cell_and_Spatial from 1adc723.

Co-Authored-By: Claude Opus 5.5 <noreply@anthropic.com>
</commit_message>
<xml_diff>
--- a/docs/Spatial_Transcriptomics_Visium_HD_Pipeline/modules/Portal_Content.docx
+++ b/docs/Spatial_Transcriptomics_Visium_HD_Pipeline/modules/Portal_Content.docx
@@ -260,7 +260,7 @@
         <w:spacing w:after="80"/>
       </w:pPr>
       <w:r>
-        <w:t xml:space="preserve">카테고리는 대분류 Single_Cell_and_Spatial(신규) 아래 분석 단계별 중분류로 정했습니다(사용자 결정, 2026-10-27). 기존 대분류(Omics 등)는 공간 전사체에 맞지 않아 새로 만들었고, 단일세포 RNA-seq 모듈도 같은 흐름(전처리, 군집, 세포 유형, 조건 비교)이라 함께 담을 수 있게 이름을 지었습니다. 중분류: Preprocessing(불러오기·정규화), Clustering(군집·통합), Spatial_Statistics(공간 가변 유전자), Differential_Expression(조건 비교), Cell_Type_Annotation(세포 유형), Reference_Check(참조 확인).</w:t>
+        <w:t xml:space="preserve">카테고리는 기능(분석 단계) 기준으로 정했습니다(사용자 결정, 2026-10-27). 발현 데이터를 다루는 모듈은 기존 Omics 대신 대분류 Gene_Expression(신규)을 만들어 Normalization(불러오기·정규화), Clustering(군집·통합), Spatial_Statistics(공간 가변 유전자), Differential_Expression(조건 비교) 중분류로 나눴습니다. RNA-seq, 단일세포, 공간 전사체 모듈을 함께 담을 수 있는 이름입니다. 세포 유형 모듈은 기존 대분류 Annotation 아래 Cell_Type_Annotation(신규), check_reference는 기존 Utility / Genomic_data_Utility입니다.</w:t>
       </w:r>
     </w:p>
     <w:p>
@@ -616,27 +616,27 @@
                 <w:sz w:val="18"/>
                 <w:szCs w:val="18"/>
               </w:rPr>
-              <w:t xml:space="preserve">Single_Cell_and_Spatial (신규)</w:t>
-            </w:r>
-          </w:p>
-        </w:tc>
-        <w:tc>
-          <w:tcPr>
-            <w:tcW w:type="dxa" w:w="3853"/>
-            <w:tcMar>
-              <w:top w:type="dxa" w:w="60"/>
-              <w:left w:type="dxa" w:w="90"/>
-              <w:bottom w:type="dxa" w:w="60"/>
-              <w:right w:type="dxa" w:w="90"/>
-            </w:tcMar>
-          </w:tcPr>
-          <w:p>
-            <w:r>
-              <w:rPr>
-                <w:sz w:val="18"/>
-                <w:szCs w:val="18"/>
-              </w:rPr>
-              <w:t xml:space="preserve">Single_Cell_and_Spatial (new)</w:t>
+              <w:t xml:space="preserve">Gene_Expression (신규)</w:t>
+            </w:r>
+          </w:p>
+        </w:tc>
+        <w:tc>
+          <w:tcPr>
+            <w:tcW w:type="dxa" w:w="3853"/>
+            <w:tcMar>
+              <w:top w:type="dxa" w:w="60"/>
+              <w:left w:type="dxa" w:w="90"/>
+              <w:bottom w:type="dxa" w:w="60"/>
+              <w:right w:type="dxa" w:w="90"/>
+            </w:tcMar>
+          </w:tcPr>
+          <w:p>
+            <w:r>
+              <w:rPr>
+                <w:sz w:val="18"/>
+                <w:szCs w:val="18"/>
+              </w:rPr>
+              <w:t xml:space="preserve">Gene_Expression (new)</w:t>
             </w:r>
           </w:p>
         </w:tc>
@@ -678,27 +678,27 @@
                 <w:sz w:val="18"/>
                 <w:szCs w:val="18"/>
               </w:rPr>
-              <w:t xml:space="preserve">Preprocessing (신규)</w:t>
-            </w:r>
-          </w:p>
-        </w:tc>
-        <w:tc>
-          <w:tcPr>
-            <w:tcW w:type="dxa" w:w="3853"/>
-            <w:tcMar>
-              <w:top w:type="dxa" w:w="60"/>
-              <w:left w:type="dxa" w:w="90"/>
-              <w:bottom w:type="dxa" w:w="60"/>
-              <w:right w:type="dxa" w:w="90"/>
-            </w:tcMar>
-          </w:tcPr>
-          <w:p>
-            <w:r>
-              <w:rPr>
-                <w:sz w:val="18"/>
-                <w:szCs w:val="18"/>
-              </w:rPr>
-              <w:t xml:space="preserve">Preprocessing (new)</w:t>
+              <w:t xml:space="preserve">Normalization (신규)</w:t>
+            </w:r>
+          </w:p>
+        </w:tc>
+        <w:tc>
+          <w:tcPr>
+            <w:tcW w:type="dxa" w:w="3853"/>
+            <w:tcMar>
+              <w:top w:type="dxa" w:w="60"/>
+              <w:left w:type="dxa" w:w="90"/>
+              <w:bottom w:type="dxa" w:w="60"/>
+              <w:right w:type="dxa" w:w="90"/>
+            </w:tcMar>
+          </w:tcPr>
+          <w:p>
+            <w:r>
+              <w:rPr>
+                <w:sz w:val="18"/>
+                <w:szCs w:val="18"/>
+              </w:rPr>
+              <w:t xml:space="preserve">Normalization (new)</w:t>
             </w:r>
           </w:p>
         </w:tc>
@@ -5181,27 +5181,27 @@
                 <w:sz w:val="18"/>
                 <w:szCs w:val="18"/>
               </w:rPr>
-              <w:t xml:space="preserve">Single_Cell_and_Spatial (신규)</w:t>
-            </w:r>
-          </w:p>
-        </w:tc>
-        <w:tc>
-          <w:tcPr>
-            <w:tcW w:type="dxa" w:w="3853"/>
-            <w:tcMar>
-              <w:top w:type="dxa" w:w="60"/>
-              <w:left w:type="dxa" w:w="90"/>
-              <w:bottom w:type="dxa" w:w="60"/>
-              <w:right w:type="dxa" w:w="90"/>
-            </w:tcMar>
-          </w:tcPr>
-          <w:p>
-            <w:r>
-              <w:rPr>
-                <w:sz w:val="18"/>
-                <w:szCs w:val="18"/>
-              </w:rPr>
-              <w:t xml:space="preserve">Single_Cell_and_Spatial (new)</w:t>
+              <w:t xml:space="preserve">Gene_Expression (신규)</w:t>
+            </w:r>
+          </w:p>
+        </w:tc>
+        <w:tc>
+          <w:tcPr>
+            <w:tcW w:type="dxa" w:w="3853"/>
+            <w:tcMar>
+              <w:top w:type="dxa" w:w="60"/>
+              <w:left w:type="dxa" w:w="90"/>
+              <w:bottom w:type="dxa" w:w="60"/>
+              <w:right w:type="dxa" w:w="90"/>
+            </w:tcMar>
+          </w:tcPr>
+          <w:p>
+            <w:r>
+              <w:rPr>
+                <w:sz w:val="18"/>
+                <w:szCs w:val="18"/>
+              </w:rPr>
+              <w:t xml:space="preserve">Gene_Expression (new)</w:t>
             </w:r>
           </w:p>
         </w:tc>
@@ -10813,27 +10813,27 @@
                 <w:sz w:val="18"/>
                 <w:szCs w:val="18"/>
               </w:rPr>
-              <w:t xml:space="preserve">Single_Cell_and_Spatial (신규)</w:t>
-            </w:r>
-          </w:p>
-        </w:tc>
-        <w:tc>
-          <w:tcPr>
-            <w:tcW w:type="dxa" w:w="3853"/>
-            <w:tcMar>
-              <w:top w:type="dxa" w:w="60"/>
-              <w:left w:type="dxa" w:w="90"/>
-              <w:bottom w:type="dxa" w:w="60"/>
-              <w:right w:type="dxa" w:w="90"/>
-            </w:tcMar>
-          </w:tcPr>
-          <w:p>
-            <w:r>
-              <w:rPr>
-                <w:sz w:val="18"/>
-                <w:szCs w:val="18"/>
-              </w:rPr>
-              <w:t xml:space="preserve">Single_Cell_and_Spatial (new)</w:t>
+              <w:t xml:space="preserve">Gene_Expression (신규)</w:t>
+            </w:r>
+          </w:p>
+        </w:tc>
+        <w:tc>
+          <w:tcPr>
+            <w:tcW w:type="dxa" w:w="3853"/>
+            <w:tcMar>
+              <w:top w:type="dxa" w:w="60"/>
+              <w:left w:type="dxa" w:w="90"/>
+              <w:bottom w:type="dxa" w:w="60"/>
+              <w:right w:type="dxa" w:w="90"/>
+            </w:tcMar>
+          </w:tcPr>
+          <w:p>
+            <w:r>
+              <w:rPr>
+                <w:sz w:val="18"/>
+                <w:szCs w:val="18"/>
+              </w:rPr>
+              <w:t xml:space="preserve">Gene_Expression (new)</w:t>
             </w:r>
           </w:p>
         </w:tc>
@@ -14848,27 +14848,27 @@
                 <w:sz w:val="18"/>
                 <w:szCs w:val="18"/>
               </w:rPr>
-              <w:t xml:space="preserve">Single_Cell_and_Spatial (신규)</w:t>
-            </w:r>
-          </w:p>
-        </w:tc>
-        <w:tc>
-          <w:tcPr>
-            <w:tcW w:type="dxa" w:w="3853"/>
-            <w:tcMar>
-              <w:top w:type="dxa" w:w="60"/>
-              <w:left w:type="dxa" w:w="90"/>
-              <w:bottom w:type="dxa" w:w="60"/>
-              <w:right w:type="dxa" w:w="90"/>
-            </w:tcMar>
-          </w:tcPr>
-          <w:p>
-            <w:r>
-              <w:rPr>
-                <w:sz w:val="18"/>
-                <w:szCs w:val="18"/>
-              </w:rPr>
-              <w:t xml:space="preserve">Single_Cell_and_Spatial (new)</w:t>
+              <w:t xml:space="preserve">Gene_Expression (신규)</w:t>
+            </w:r>
+          </w:p>
+        </w:tc>
+        <w:tc>
+          <w:tcPr>
+            <w:tcW w:type="dxa" w:w="3853"/>
+            <w:tcMar>
+              <w:top w:type="dxa" w:w="60"/>
+              <w:left w:type="dxa" w:w="90"/>
+              <w:bottom w:type="dxa" w:w="60"/>
+              <w:right w:type="dxa" w:w="90"/>
+            </w:tcMar>
+          </w:tcPr>
+          <w:p>
+            <w:r>
+              <w:rPr>
+                <w:sz w:val="18"/>
+                <w:szCs w:val="18"/>
+              </w:rPr>
+              <w:t xml:space="preserve">Gene_Expression (new)</w:t>
             </w:r>
           </w:p>
         </w:tc>
@@ -20631,27 +20631,27 @@
                 <w:sz w:val="18"/>
                 <w:szCs w:val="18"/>
               </w:rPr>
-              <w:t xml:space="preserve">Single_Cell_and_Spatial (신규)</w:t>
-            </w:r>
-          </w:p>
-        </w:tc>
-        <w:tc>
-          <w:tcPr>
-            <w:tcW w:type="dxa" w:w="3853"/>
-            <w:tcMar>
-              <w:top w:type="dxa" w:w="60"/>
-              <w:left w:type="dxa" w:w="90"/>
-              <w:bottom w:type="dxa" w:w="60"/>
-              <w:right w:type="dxa" w:w="90"/>
-            </w:tcMar>
-          </w:tcPr>
-          <w:p>
-            <w:r>
-              <w:rPr>
-                <w:sz w:val="18"/>
-                <w:szCs w:val="18"/>
-              </w:rPr>
-              <w:t xml:space="preserve">Single_Cell_and_Spatial (new)</w:t>
+              <w:t xml:space="preserve">Annotation</w:t>
+            </w:r>
+          </w:p>
+        </w:tc>
+        <w:tc>
+          <w:tcPr>
+            <w:tcW w:type="dxa" w:w="3853"/>
+            <w:tcMar>
+              <w:top w:type="dxa" w:w="60"/>
+              <w:left w:type="dxa" w:w="90"/>
+              <w:bottom w:type="dxa" w:w="60"/>
+              <w:right w:type="dxa" w:w="90"/>
+            </w:tcMar>
+          </w:tcPr>
+          <w:p>
+            <w:r>
+              <w:rPr>
+                <w:sz w:val="18"/>
+                <w:szCs w:val="18"/>
+              </w:rPr>
+              <w:t xml:space="preserve">Annotation</w:t>
             </w:r>
           </w:p>
         </w:tc>
@@ -25413,27 +25413,27 @@
                 <w:sz w:val="18"/>
                 <w:szCs w:val="18"/>
               </w:rPr>
-              <w:t xml:space="preserve">Single_Cell_and_Spatial (신규)</w:t>
-            </w:r>
-          </w:p>
-        </w:tc>
-        <w:tc>
-          <w:tcPr>
-            <w:tcW w:type="dxa" w:w="3853"/>
-            <w:tcMar>
-              <w:top w:type="dxa" w:w="60"/>
-              <w:left w:type="dxa" w:w="90"/>
-              <w:bottom w:type="dxa" w:w="60"/>
-              <w:right w:type="dxa" w:w="90"/>
-            </w:tcMar>
-          </w:tcPr>
-          <w:p>
-            <w:r>
-              <w:rPr>
-                <w:sz w:val="18"/>
-                <w:szCs w:val="18"/>
-              </w:rPr>
-              <w:t xml:space="preserve">Single_Cell_and_Spatial (new)</w:t>
+              <w:t xml:space="preserve">Utility</w:t>
+            </w:r>
+          </w:p>
+        </w:tc>
+        <w:tc>
+          <w:tcPr>
+            <w:tcW w:type="dxa" w:w="3853"/>
+            <w:tcMar>
+              <w:top w:type="dxa" w:w="60"/>
+              <w:left w:type="dxa" w:w="90"/>
+              <w:bottom w:type="dxa" w:w="60"/>
+              <w:right w:type="dxa" w:w="90"/>
+            </w:tcMar>
+          </w:tcPr>
+          <w:p>
+            <w:r>
+              <w:rPr>
+                <w:sz w:val="18"/>
+                <w:szCs w:val="18"/>
+              </w:rPr>
+              <w:t xml:space="preserve">Utility</w:t>
             </w:r>
           </w:p>
         </w:tc>
@@ -25475,27 +25475,27 @@
                 <w:sz w:val="18"/>
                 <w:szCs w:val="18"/>
               </w:rPr>
-              <w:t xml:space="preserve">Reference_Check (신규)</w:t>
-            </w:r>
-          </w:p>
-        </w:tc>
-        <w:tc>
-          <w:tcPr>
-            <w:tcW w:type="dxa" w:w="3853"/>
-            <w:tcMar>
-              <w:top w:type="dxa" w:w="60"/>
-              <w:left w:type="dxa" w:w="90"/>
-              <w:bottom w:type="dxa" w:w="60"/>
-              <w:right w:type="dxa" w:w="90"/>
-            </w:tcMar>
-          </w:tcPr>
-          <w:p>
-            <w:r>
-              <w:rPr>
-                <w:sz w:val="18"/>
-                <w:szCs w:val="18"/>
-              </w:rPr>
-              <w:t xml:space="preserve">Reference_Check (new)</w:t>
+              <w:t xml:space="preserve">Genomic_data_Utility</w:t>
+            </w:r>
+          </w:p>
+        </w:tc>
+        <w:tc>
+          <w:tcPr>
+            <w:tcW w:type="dxa" w:w="3853"/>
+            <w:tcMar>
+              <w:top w:type="dxa" w:w="60"/>
+              <w:left w:type="dxa" w:w="90"/>
+              <w:bottom w:type="dxa" w:w="60"/>
+              <w:right w:type="dxa" w:w="90"/>
+            </w:tcMar>
+          </w:tcPr>
+          <w:p>
+            <w:r>
+              <w:rPr>
+                <w:sz w:val="18"/>
+                <w:szCs w:val="18"/>
+              </w:rPr>
+              <w:t xml:space="preserve">Genomic_data_Utility</w:t>
             </w:r>
           </w:p>
         </w:tc>

</xml_diff>

<commit_message>
Spatial categories: Transcriptomics (data domain) with operation middles; guide rule benchmarked on Galaxy and EDAM
Co-Authored-By: Claude Opus 5.5 <noreply@anthropic.com>
</commit_message>
<xml_diff>
--- a/docs/Spatial_Transcriptomics_Visium_HD_Pipeline/modules/Portal_Content.docx
+++ b/docs/Spatial_Transcriptomics_Visium_HD_Pipeline/modules/Portal_Content.docx
@@ -260,7 +260,7 @@
         <w:spacing w:after="80"/>
       </w:pPr>
       <w:r>
-        <w:t xml:space="preserve">카테고리는 기능(분석 단계) 기준으로 정했습니다(사용자 결정, 2026-10-27). 발현 데이터를 다루는 모듈은 기존 Omics 대신 대분류 Gene_Expression(신규)을 만들어 Normalization(불러오기·정규화), Clustering(군집·통합), Spatial_Statistics(공간 가변 유전자), Differential_Expression(조건 비교) 중분류로 나눴습니다. RNA-seq, 단일세포, 공간 전사체 모듈을 함께 담을 수 있는 이름입니다. 세포 유형 모듈은 기존 대분류 Annotation 아래 Cell_Type_Annotation(신규), check_reference는 기존 Utility / Genomic_data_Utility입니다.</w:t>
+        <w:t xml:space="preserve">카테고리는 대분류를 데이터 분야, 중분류를 작업으로 정했습니다(사용자 결정, 2026-10-27). Galaxy(usegalaxy.eu 도구 메뉴: Single-cell, Spatial Omics, RNA Analysis 등 분야 메뉴)와 bio.tools/EDAM(Topic = 분야, Operation = 작업)을 참고했고, 사용자가 "내 데이터로 무엇을 할 수 있나"로 찾는 순서에 맞췄습니다. 모든 공간 전사체 모듈은 대분류 Transcriptomics(신규) 아래 Normalization, Clustering, Spatial_Statistics, Differential_Expression, Cell_Type_Annotation(모두 신규)에 둡니다. check_reference는 세포 유형 모듈에 넣을 참조를 확인하는 도구라 Cell_Type_Annotation에 함께 둡니다. 단일세포·bulk RNA-seq 모듈도 같은 중분류에 넣고 모듈 이름으로 구분합니다.</w:t>
       </w:r>
     </w:p>
     <w:p>
@@ -616,27 +616,27 @@
                 <w:sz w:val="18"/>
                 <w:szCs w:val="18"/>
               </w:rPr>
-              <w:t xml:space="preserve">Gene_Expression (신규)</w:t>
-            </w:r>
-          </w:p>
-        </w:tc>
-        <w:tc>
-          <w:tcPr>
-            <w:tcW w:type="dxa" w:w="3853"/>
-            <w:tcMar>
-              <w:top w:type="dxa" w:w="60"/>
-              <w:left w:type="dxa" w:w="90"/>
-              <w:bottom w:type="dxa" w:w="60"/>
-              <w:right w:type="dxa" w:w="90"/>
-            </w:tcMar>
-          </w:tcPr>
-          <w:p>
-            <w:r>
-              <w:rPr>
-                <w:sz w:val="18"/>
-                <w:szCs w:val="18"/>
-              </w:rPr>
-              <w:t xml:space="preserve">Gene_Expression (new)</w:t>
+              <w:t xml:space="preserve">Transcriptomics (신규)</w:t>
+            </w:r>
+          </w:p>
+        </w:tc>
+        <w:tc>
+          <w:tcPr>
+            <w:tcW w:type="dxa" w:w="3853"/>
+            <w:tcMar>
+              <w:top w:type="dxa" w:w="60"/>
+              <w:left w:type="dxa" w:w="90"/>
+              <w:bottom w:type="dxa" w:w="60"/>
+              <w:right w:type="dxa" w:w="90"/>
+            </w:tcMar>
+          </w:tcPr>
+          <w:p>
+            <w:r>
+              <w:rPr>
+                <w:sz w:val="18"/>
+                <w:szCs w:val="18"/>
+              </w:rPr>
+              <w:t xml:space="preserve">Transcriptomics (new)</w:t>
             </w:r>
           </w:p>
         </w:tc>
@@ -5181,27 +5181,27 @@
                 <w:sz w:val="18"/>
                 <w:szCs w:val="18"/>
               </w:rPr>
-              <w:t xml:space="preserve">Gene_Expression (신규)</w:t>
-            </w:r>
-          </w:p>
-        </w:tc>
-        <w:tc>
-          <w:tcPr>
-            <w:tcW w:type="dxa" w:w="3853"/>
-            <w:tcMar>
-              <w:top w:type="dxa" w:w="60"/>
-              <w:left w:type="dxa" w:w="90"/>
-              <w:bottom w:type="dxa" w:w="60"/>
-              <w:right w:type="dxa" w:w="90"/>
-            </w:tcMar>
-          </w:tcPr>
-          <w:p>
-            <w:r>
-              <w:rPr>
-                <w:sz w:val="18"/>
-                <w:szCs w:val="18"/>
-              </w:rPr>
-              <w:t xml:space="preserve">Gene_Expression (new)</w:t>
+              <w:t xml:space="preserve">Transcriptomics (신규)</w:t>
+            </w:r>
+          </w:p>
+        </w:tc>
+        <w:tc>
+          <w:tcPr>
+            <w:tcW w:type="dxa" w:w="3853"/>
+            <w:tcMar>
+              <w:top w:type="dxa" w:w="60"/>
+              <w:left w:type="dxa" w:w="90"/>
+              <w:bottom w:type="dxa" w:w="60"/>
+              <w:right w:type="dxa" w:w="90"/>
+            </w:tcMar>
+          </w:tcPr>
+          <w:p>
+            <w:r>
+              <w:rPr>
+                <w:sz w:val="18"/>
+                <w:szCs w:val="18"/>
+              </w:rPr>
+              <w:t xml:space="preserve">Transcriptomics (new)</w:t>
             </w:r>
           </w:p>
         </w:tc>
@@ -10813,27 +10813,27 @@
                 <w:sz w:val="18"/>
                 <w:szCs w:val="18"/>
               </w:rPr>
-              <w:t xml:space="preserve">Gene_Expression (신규)</w:t>
-            </w:r>
-          </w:p>
-        </w:tc>
-        <w:tc>
-          <w:tcPr>
-            <w:tcW w:type="dxa" w:w="3853"/>
-            <w:tcMar>
-              <w:top w:type="dxa" w:w="60"/>
-              <w:left w:type="dxa" w:w="90"/>
-              <w:bottom w:type="dxa" w:w="60"/>
-              <w:right w:type="dxa" w:w="90"/>
-            </w:tcMar>
-          </w:tcPr>
-          <w:p>
-            <w:r>
-              <w:rPr>
-                <w:sz w:val="18"/>
-                <w:szCs w:val="18"/>
-              </w:rPr>
-              <w:t xml:space="preserve">Gene_Expression (new)</w:t>
+              <w:t xml:space="preserve">Transcriptomics (신규)</w:t>
+            </w:r>
+          </w:p>
+        </w:tc>
+        <w:tc>
+          <w:tcPr>
+            <w:tcW w:type="dxa" w:w="3853"/>
+            <w:tcMar>
+              <w:top w:type="dxa" w:w="60"/>
+              <w:left w:type="dxa" w:w="90"/>
+              <w:bottom w:type="dxa" w:w="60"/>
+              <w:right w:type="dxa" w:w="90"/>
+            </w:tcMar>
+          </w:tcPr>
+          <w:p>
+            <w:r>
+              <w:rPr>
+                <w:sz w:val="18"/>
+                <w:szCs w:val="18"/>
+              </w:rPr>
+              <w:t xml:space="preserve">Transcriptomics (new)</w:t>
             </w:r>
           </w:p>
         </w:tc>
@@ -14848,27 +14848,27 @@
                 <w:sz w:val="18"/>
                 <w:szCs w:val="18"/>
               </w:rPr>
-              <w:t xml:space="preserve">Gene_Expression (신규)</w:t>
-            </w:r>
-          </w:p>
-        </w:tc>
-        <w:tc>
-          <w:tcPr>
-            <w:tcW w:type="dxa" w:w="3853"/>
-            <w:tcMar>
-              <w:top w:type="dxa" w:w="60"/>
-              <w:left w:type="dxa" w:w="90"/>
-              <w:bottom w:type="dxa" w:w="60"/>
-              <w:right w:type="dxa" w:w="90"/>
-            </w:tcMar>
-          </w:tcPr>
-          <w:p>
-            <w:r>
-              <w:rPr>
-                <w:sz w:val="18"/>
-                <w:szCs w:val="18"/>
-              </w:rPr>
-              <w:t xml:space="preserve">Gene_Expression (new)</w:t>
+              <w:t xml:space="preserve">Transcriptomics (신규)</w:t>
+            </w:r>
+          </w:p>
+        </w:tc>
+        <w:tc>
+          <w:tcPr>
+            <w:tcW w:type="dxa" w:w="3853"/>
+            <w:tcMar>
+              <w:top w:type="dxa" w:w="60"/>
+              <w:left w:type="dxa" w:w="90"/>
+              <w:bottom w:type="dxa" w:w="60"/>
+              <w:right w:type="dxa" w:w="90"/>
+            </w:tcMar>
+          </w:tcPr>
+          <w:p>
+            <w:r>
+              <w:rPr>
+                <w:sz w:val="18"/>
+                <w:szCs w:val="18"/>
+              </w:rPr>
+              <w:t xml:space="preserve">Transcriptomics (new)</w:t>
             </w:r>
           </w:p>
         </w:tc>
@@ -20631,27 +20631,27 @@
                 <w:sz w:val="18"/>
                 <w:szCs w:val="18"/>
               </w:rPr>
-              <w:t xml:space="preserve">Annotation</w:t>
-            </w:r>
-          </w:p>
-        </w:tc>
-        <w:tc>
-          <w:tcPr>
-            <w:tcW w:type="dxa" w:w="3853"/>
-            <w:tcMar>
-              <w:top w:type="dxa" w:w="60"/>
-              <w:left w:type="dxa" w:w="90"/>
-              <w:bottom w:type="dxa" w:w="60"/>
-              <w:right w:type="dxa" w:w="90"/>
-            </w:tcMar>
-          </w:tcPr>
-          <w:p>
-            <w:r>
-              <w:rPr>
-                <w:sz w:val="18"/>
-                <w:szCs w:val="18"/>
-              </w:rPr>
-              <w:t xml:space="preserve">Annotation</w:t>
+              <w:t xml:space="preserve">Transcriptomics (신규)</w:t>
+            </w:r>
+          </w:p>
+        </w:tc>
+        <w:tc>
+          <w:tcPr>
+            <w:tcW w:type="dxa" w:w="3853"/>
+            <w:tcMar>
+              <w:top w:type="dxa" w:w="60"/>
+              <w:left w:type="dxa" w:w="90"/>
+              <w:bottom w:type="dxa" w:w="60"/>
+              <w:right w:type="dxa" w:w="90"/>
+            </w:tcMar>
+          </w:tcPr>
+          <w:p>
+            <w:r>
+              <w:rPr>
+                <w:sz w:val="18"/>
+                <w:szCs w:val="18"/>
+              </w:rPr>
+              <w:t xml:space="preserve">Transcriptomics (new)</w:t>
             </w:r>
           </w:p>
         </w:tc>
@@ -25413,27 +25413,27 @@
                 <w:sz w:val="18"/>
                 <w:szCs w:val="18"/>
               </w:rPr>
-              <w:t xml:space="preserve">Utility</w:t>
-            </w:r>
-          </w:p>
-        </w:tc>
-        <w:tc>
-          <w:tcPr>
-            <w:tcW w:type="dxa" w:w="3853"/>
-            <w:tcMar>
-              <w:top w:type="dxa" w:w="60"/>
-              <w:left w:type="dxa" w:w="90"/>
-              <w:bottom w:type="dxa" w:w="60"/>
-              <w:right w:type="dxa" w:w="90"/>
-            </w:tcMar>
-          </w:tcPr>
-          <w:p>
-            <w:r>
-              <w:rPr>
-                <w:sz w:val="18"/>
-                <w:szCs w:val="18"/>
-              </w:rPr>
-              <w:t xml:space="preserve">Utility</w:t>
+              <w:t xml:space="preserve">Transcriptomics (신규)</w:t>
+            </w:r>
+          </w:p>
+        </w:tc>
+        <w:tc>
+          <w:tcPr>
+            <w:tcW w:type="dxa" w:w="3853"/>
+            <w:tcMar>
+              <w:top w:type="dxa" w:w="60"/>
+              <w:left w:type="dxa" w:w="90"/>
+              <w:bottom w:type="dxa" w:w="60"/>
+              <w:right w:type="dxa" w:w="90"/>
+            </w:tcMar>
+          </w:tcPr>
+          <w:p>
+            <w:r>
+              <w:rPr>
+                <w:sz w:val="18"/>
+                <w:szCs w:val="18"/>
+              </w:rPr>
+              <w:t xml:space="preserve">Transcriptomics (new)</w:t>
             </w:r>
           </w:p>
         </w:tc>
@@ -25475,27 +25475,27 @@
                 <w:sz w:val="18"/>
                 <w:szCs w:val="18"/>
               </w:rPr>
-              <w:t xml:space="preserve">Genomic_data_Utility</w:t>
-            </w:r>
-          </w:p>
-        </w:tc>
-        <w:tc>
-          <w:tcPr>
-            <w:tcW w:type="dxa" w:w="3853"/>
-            <w:tcMar>
-              <w:top w:type="dxa" w:w="60"/>
-              <w:left w:type="dxa" w:w="90"/>
-              <w:bottom w:type="dxa" w:w="60"/>
-              <w:right w:type="dxa" w:w="90"/>
-            </w:tcMar>
-          </w:tcPr>
-          <w:p>
-            <w:r>
-              <w:rPr>
-                <w:sz w:val="18"/>
-                <w:szCs w:val="18"/>
-              </w:rPr>
-              <w:t xml:space="preserve">Genomic_data_Utility</w:t>
+              <w:t xml:space="preserve">Cell_Type_Annotation (신규)</w:t>
+            </w:r>
+          </w:p>
+        </w:tc>
+        <w:tc>
+          <w:tcPr>
+            <w:tcW w:type="dxa" w:w="3853"/>
+            <w:tcMar>
+              <w:top w:type="dxa" w:w="60"/>
+              <w:left w:type="dxa" w:w="90"/>
+              <w:bottom w:type="dxa" w:w="60"/>
+              <w:right w:type="dxa" w:w="90"/>
+            </w:tcMar>
+          </w:tcPr>
+          <w:p>
+            <w:r>
+              <w:rPr>
+                <w:sz w:val="18"/>
+                <w:szCs w:val="18"/>
+              </w:rPr>
+              <w:t xml:space="preserve">Cell_Type_Annotation (new)</w:t>
             </w:r>
           </w:p>
         </w:tc>

</xml_diff>

<commit_message>
Spatial categories by analysis stage: Preprocessing, Clustering, Statistics_and_Visualization, Annotation
Co-Authored-By: Claude Opus 5.5 <noreply@anthropic.com>
</commit_message>
<xml_diff>
--- a/docs/Spatial_Transcriptomics_Visium_HD_Pipeline/modules/Portal_Content.docx
+++ b/docs/Spatial_Transcriptomics_Visium_HD_Pipeline/modules/Portal_Content.docx
@@ -260,7 +260,7 @@
         <w:spacing w:after="80"/>
       </w:pPr>
       <w:r>
-        <w:t xml:space="preserve">카테고리는 대분류를 데이터 분야, 중분류를 작업으로 정했습니다(사용자 결정, 2026-10-27). Galaxy(usegalaxy.eu 도구 메뉴: Single-cell, Spatial Omics, RNA Analysis 등 분야 메뉴)와 bio.tools/EDAM(Topic = 분야, Operation = 작업)을 참고했고, 사용자가 "내 데이터로 무엇을 할 수 있나"로 찾는 순서에 맞췄습니다. 모든 공간 전사체 모듈은 대분류 Transcriptomics(신규) 아래 Normalization, Clustering, Spatial_Statistics, Differential_Expression, Cell_Type_Annotation(모두 신규)에 둡니다. check_reference는 세포 유형 모듈에 넣을 참조를 확인하는 도구라 Cell_Type_Annotation에 함께 둡니다. 단일세포·bulk RNA-seq 모듈도 같은 중분류에 넣고 모듈 이름으로 구분합니다.</w:t>
+        <w:t xml:space="preserve">카테고리는 대분류 = 분석 단계, 중분류 = 구체적 작업으로 정했습니다(사용자 결정, 2026-10-27). 데이터 종류는 모듈 이름(spatial_*)이 보여 줍니다. spatial_prep·spatial_hd_prep은 Preprocessing(신규) / Normalization(신규), 군집 모듈은 Clustering(신규) / Spatial_Clustering(신규; 묶는 대상별 중분류로 나중에 Cell_Clustering, Sample_Clustering 등을 둔다), p값을 내는 검정인 spatial_svf·spatial_hd_svf(Moran's I)와 spatial_condition_de(DESeq2)는 Statistics_and_Visualization 아래 Spatial_Statistics(신규)와 Differential_Analysis(신규)에 둡니다. 세포 유형 모듈과 check_reference는 기존 Annotation의 "무엇에 주석을 다는가" 방식에 맞춰 Cell_Type_Annotation(신규)입니다. 포탈의 현재 이름 Statisitcs_and_Visualization은 오타라 Statistics_and_Visualization으로 적었습니다.</w:t>
       </w:r>
     </w:p>
     <w:p>
@@ -616,27 +616,27 @@
                 <w:sz w:val="18"/>
                 <w:szCs w:val="18"/>
               </w:rPr>
-              <w:t xml:space="preserve">Transcriptomics (신규)</w:t>
-            </w:r>
-          </w:p>
-        </w:tc>
-        <w:tc>
-          <w:tcPr>
-            <w:tcW w:type="dxa" w:w="3853"/>
-            <w:tcMar>
-              <w:top w:type="dxa" w:w="60"/>
-              <w:left w:type="dxa" w:w="90"/>
-              <w:bottom w:type="dxa" w:w="60"/>
-              <w:right w:type="dxa" w:w="90"/>
-            </w:tcMar>
-          </w:tcPr>
-          <w:p>
-            <w:r>
-              <w:rPr>
-                <w:sz w:val="18"/>
-                <w:szCs w:val="18"/>
-              </w:rPr>
-              <w:t xml:space="preserve">Transcriptomics (new)</w:t>
+              <w:t xml:space="preserve">Preprocessing (신규)</w:t>
+            </w:r>
+          </w:p>
+        </w:tc>
+        <w:tc>
+          <w:tcPr>
+            <w:tcW w:type="dxa" w:w="3853"/>
+            <w:tcMar>
+              <w:top w:type="dxa" w:w="60"/>
+              <w:left w:type="dxa" w:w="90"/>
+              <w:bottom w:type="dxa" w:w="60"/>
+              <w:right w:type="dxa" w:w="90"/>
+            </w:tcMar>
+          </w:tcPr>
+          <w:p>
+            <w:r>
+              <w:rPr>
+                <w:sz w:val="18"/>
+                <w:szCs w:val="18"/>
+              </w:rPr>
+              <w:t xml:space="preserve">Preprocessing (new)</w:t>
             </w:r>
           </w:p>
         </w:tc>
@@ -5181,27 +5181,27 @@
                 <w:sz w:val="18"/>
                 <w:szCs w:val="18"/>
               </w:rPr>
-              <w:t xml:space="preserve">Transcriptomics (신규)</w:t>
-            </w:r>
-          </w:p>
-        </w:tc>
-        <w:tc>
-          <w:tcPr>
-            <w:tcW w:type="dxa" w:w="3853"/>
-            <w:tcMar>
-              <w:top w:type="dxa" w:w="60"/>
-              <w:left w:type="dxa" w:w="90"/>
-              <w:bottom w:type="dxa" w:w="60"/>
-              <w:right w:type="dxa" w:w="90"/>
-            </w:tcMar>
-          </w:tcPr>
-          <w:p>
-            <w:r>
-              <w:rPr>
-                <w:sz w:val="18"/>
-                <w:szCs w:val="18"/>
-              </w:rPr>
-              <w:t xml:space="preserve">Transcriptomics (new)</w:t>
+              <w:t xml:space="preserve">Clustering (신규)</w:t>
+            </w:r>
+          </w:p>
+        </w:tc>
+        <w:tc>
+          <w:tcPr>
+            <w:tcW w:type="dxa" w:w="3853"/>
+            <w:tcMar>
+              <w:top w:type="dxa" w:w="60"/>
+              <w:left w:type="dxa" w:w="90"/>
+              <w:bottom w:type="dxa" w:w="60"/>
+              <w:right w:type="dxa" w:w="90"/>
+            </w:tcMar>
+          </w:tcPr>
+          <w:p>
+            <w:r>
+              <w:rPr>
+                <w:sz w:val="18"/>
+                <w:szCs w:val="18"/>
+              </w:rPr>
+              <w:t xml:space="preserve">Clustering (new)</w:t>
             </w:r>
           </w:p>
         </w:tc>
@@ -5243,27 +5243,27 @@
                 <w:sz w:val="18"/>
                 <w:szCs w:val="18"/>
               </w:rPr>
-              <w:t xml:space="preserve">Clustering (신규)</w:t>
-            </w:r>
-          </w:p>
-        </w:tc>
-        <w:tc>
-          <w:tcPr>
-            <w:tcW w:type="dxa" w:w="3853"/>
-            <w:tcMar>
-              <w:top w:type="dxa" w:w="60"/>
-              <w:left w:type="dxa" w:w="90"/>
-              <w:bottom w:type="dxa" w:w="60"/>
-              <w:right w:type="dxa" w:w="90"/>
-            </w:tcMar>
-          </w:tcPr>
-          <w:p>
-            <w:r>
-              <w:rPr>
-                <w:sz w:val="18"/>
-                <w:szCs w:val="18"/>
-              </w:rPr>
-              <w:t xml:space="preserve">Clustering (new)</w:t>
+              <w:t xml:space="preserve">Spatial_Clustering (신규)</w:t>
+            </w:r>
+          </w:p>
+        </w:tc>
+        <w:tc>
+          <w:tcPr>
+            <w:tcW w:type="dxa" w:w="3853"/>
+            <w:tcMar>
+              <w:top w:type="dxa" w:w="60"/>
+              <w:left w:type="dxa" w:w="90"/>
+              <w:bottom w:type="dxa" w:w="60"/>
+              <w:right w:type="dxa" w:w="90"/>
+            </w:tcMar>
+          </w:tcPr>
+          <w:p>
+            <w:r>
+              <w:rPr>
+                <w:sz w:val="18"/>
+                <w:szCs w:val="18"/>
+              </w:rPr>
+              <w:t xml:space="preserve">Spatial_Clustering (new)</w:t>
             </w:r>
           </w:p>
         </w:tc>
@@ -10813,27 +10813,27 @@
                 <w:sz w:val="18"/>
                 <w:szCs w:val="18"/>
               </w:rPr>
-              <w:t xml:space="preserve">Transcriptomics (신규)</w:t>
-            </w:r>
-          </w:p>
-        </w:tc>
-        <w:tc>
-          <w:tcPr>
-            <w:tcW w:type="dxa" w:w="3853"/>
-            <w:tcMar>
-              <w:top w:type="dxa" w:w="60"/>
-              <w:left w:type="dxa" w:w="90"/>
-              <w:bottom w:type="dxa" w:w="60"/>
-              <w:right w:type="dxa" w:w="90"/>
-            </w:tcMar>
-          </w:tcPr>
-          <w:p>
-            <w:r>
-              <w:rPr>
-                <w:sz w:val="18"/>
-                <w:szCs w:val="18"/>
-              </w:rPr>
-              <w:t xml:space="preserve">Transcriptomics (new)</w:t>
+              <w:t xml:space="preserve">Statistics_and_Visualization</w:t>
+            </w:r>
+          </w:p>
+        </w:tc>
+        <w:tc>
+          <w:tcPr>
+            <w:tcW w:type="dxa" w:w="3853"/>
+            <w:tcMar>
+              <w:top w:type="dxa" w:w="60"/>
+              <w:left w:type="dxa" w:w="90"/>
+              <w:bottom w:type="dxa" w:w="60"/>
+              <w:right w:type="dxa" w:w="90"/>
+            </w:tcMar>
+          </w:tcPr>
+          <w:p>
+            <w:r>
+              <w:rPr>
+                <w:sz w:val="18"/>
+                <w:szCs w:val="18"/>
+              </w:rPr>
+              <w:t xml:space="preserve">Statistics_and_Visualization</w:t>
             </w:r>
           </w:p>
         </w:tc>
@@ -14848,27 +14848,27 @@
                 <w:sz w:val="18"/>
                 <w:szCs w:val="18"/>
               </w:rPr>
-              <w:t xml:space="preserve">Transcriptomics (신규)</w:t>
-            </w:r>
-          </w:p>
-        </w:tc>
-        <w:tc>
-          <w:tcPr>
-            <w:tcW w:type="dxa" w:w="3853"/>
-            <w:tcMar>
-              <w:top w:type="dxa" w:w="60"/>
-              <w:left w:type="dxa" w:w="90"/>
-              <w:bottom w:type="dxa" w:w="60"/>
-              <w:right w:type="dxa" w:w="90"/>
-            </w:tcMar>
-          </w:tcPr>
-          <w:p>
-            <w:r>
-              <w:rPr>
-                <w:sz w:val="18"/>
-                <w:szCs w:val="18"/>
-              </w:rPr>
-              <w:t xml:space="preserve">Transcriptomics (new)</w:t>
+              <w:t xml:space="preserve">Statistics_and_Visualization</w:t>
+            </w:r>
+          </w:p>
+        </w:tc>
+        <w:tc>
+          <w:tcPr>
+            <w:tcW w:type="dxa" w:w="3853"/>
+            <w:tcMar>
+              <w:top w:type="dxa" w:w="60"/>
+              <w:left w:type="dxa" w:w="90"/>
+              <w:bottom w:type="dxa" w:w="60"/>
+              <w:right w:type="dxa" w:w="90"/>
+            </w:tcMar>
+          </w:tcPr>
+          <w:p>
+            <w:r>
+              <w:rPr>
+                <w:sz w:val="18"/>
+                <w:szCs w:val="18"/>
+              </w:rPr>
+              <w:t xml:space="preserve">Statistics_and_Visualization</w:t>
             </w:r>
           </w:p>
         </w:tc>
@@ -14910,27 +14910,27 @@
                 <w:sz w:val="18"/>
                 <w:szCs w:val="18"/>
               </w:rPr>
-              <w:t xml:space="preserve">Differential_Expression (신규)</w:t>
-            </w:r>
-          </w:p>
-        </w:tc>
-        <w:tc>
-          <w:tcPr>
-            <w:tcW w:type="dxa" w:w="3853"/>
-            <w:tcMar>
-              <w:top w:type="dxa" w:w="60"/>
-              <w:left w:type="dxa" w:w="90"/>
-              <w:bottom w:type="dxa" w:w="60"/>
-              <w:right w:type="dxa" w:w="90"/>
-            </w:tcMar>
-          </w:tcPr>
-          <w:p>
-            <w:r>
-              <w:rPr>
-                <w:sz w:val="18"/>
-                <w:szCs w:val="18"/>
-              </w:rPr>
-              <w:t xml:space="preserve">Differential_Expression (new)</w:t>
+              <w:t xml:space="preserve">Differential_Analysis (신규)</w:t>
+            </w:r>
+          </w:p>
+        </w:tc>
+        <w:tc>
+          <w:tcPr>
+            <w:tcW w:type="dxa" w:w="3853"/>
+            <w:tcMar>
+              <w:top w:type="dxa" w:w="60"/>
+              <w:left w:type="dxa" w:w="90"/>
+              <w:bottom w:type="dxa" w:w="60"/>
+              <w:right w:type="dxa" w:w="90"/>
+            </w:tcMar>
+          </w:tcPr>
+          <w:p>
+            <w:r>
+              <w:rPr>
+                <w:sz w:val="18"/>
+                <w:szCs w:val="18"/>
+              </w:rPr>
+              <w:t xml:space="preserve">Differential_Analysis (new)</w:t>
             </w:r>
           </w:p>
         </w:tc>
@@ -20631,27 +20631,27 @@
                 <w:sz w:val="18"/>
                 <w:szCs w:val="18"/>
               </w:rPr>
-              <w:t xml:space="preserve">Transcriptomics (신규)</w:t>
-            </w:r>
-          </w:p>
-        </w:tc>
-        <w:tc>
-          <w:tcPr>
-            <w:tcW w:type="dxa" w:w="3853"/>
-            <w:tcMar>
-              <w:top w:type="dxa" w:w="60"/>
-              <w:left w:type="dxa" w:w="90"/>
-              <w:bottom w:type="dxa" w:w="60"/>
-              <w:right w:type="dxa" w:w="90"/>
-            </w:tcMar>
-          </w:tcPr>
-          <w:p>
-            <w:r>
-              <w:rPr>
-                <w:sz w:val="18"/>
-                <w:szCs w:val="18"/>
-              </w:rPr>
-              <w:t xml:space="preserve">Transcriptomics (new)</w:t>
+              <w:t xml:space="preserve">Annotation</w:t>
+            </w:r>
+          </w:p>
+        </w:tc>
+        <w:tc>
+          <w:tcPr>
+            <w:tcW w:type="dxa" w:w="3853"/>
+            <w:tcMar>
+              <w:top w:type="dxa" w:w="60"/>
+              <w:left w:type="dxa" w:w="90"/>
+              <w:bottom w:type="dxa" w:w="60"/>
+              <w:right w:type="dxa" w:w="90"/>
+            </w:tcMar>
+          </w:tcPr>
+          <w:p>
+            <w:r>
+              <w:rPr>
+                <w:sz w:val="18"/>
+                <w:szCs w:val="18"/>
+              </w:rPr>
+              <w:t xml:space="preserve">Annotation</w:t>
             </w:r>
           </w:p>
         </w:tc>
@@ -25413,27 +25413,27 @@
                 <w:sz w:val="18"/>
                 <w:szCs w:val="18"/>
               </w:rPr>
-              <w:t xml:space="preserve">Transcriptomics (신규)</w:t>
-            </w:r>
-          </w:p>
-        </w:tc>
-        <w:tc>
-          <w:tcPr>
-            <w:tcW w:type="dxa" w:w="3853"/>
-            <w:tcMar>
-              <w:top w:type="dxa" w:w="60"/>
-              <w:left w:type="dxa" w:w="90"/>
-              <w:bottom w:type="dxa" w:w="60"/>
-              <w:right w:type="dxa" w:w="90"/>
-            </w:tcMar>
-          </w:tcPr>
-          <w:p>
-            <w:r>
-              <w:rPr>
-                <w:sz w:val="18"/>
-                <w:szCs w:val="18"/>
-              </w:rPr>
-              <w:t xml:space="preserve">Transcriptomics (new)</w:t>
+              <w:t xml:space="preserve">Annotation</w:t>
+            </w:r>
+          </w:p>
+        </w:tc>
+        <w:tc>
+          <w:tcPr>
+            <w:tcW w:type="dxa" w:w="3853"/>
+            <w:tcMar>
+              <w:top w:type="dxa" w:w="60"/>
+              <w:left w:type="dxa" w:w="90"/>
+              <w:bottom w:type="dxa" w:w="60"/>
+              <w:right w:type="dxa" w:w="90"/>
+            </w:tcMar>
+          </w:tcPr>
+          <w:p>
+            <w:r>
+              <w:rPr>
+                <w:sz w:val="18"/>
+                <w:szCs w:val="18"/>
+              </w:rPr>
+              <w:t xml:space="preserve">Annotation</w:t>
             </w:r>
           </w:p>
         </w:tc>

</xml_diff>

<commit_message>
Spatial own concept figures: only the panels the content needs
Panels that repeat the paper figure placed before the drawing, list
inputs already in the parameter table, or show outputs are dropped
(KEEP table in make_module_concepts.py); most module drawings now have
two panels, hd_prep keeps three. The pipeline drawing loses its
spots-and-bins panel (Williams Fig. 1 shows it). Legends relettered,
figure margins trimmed.

Co-Authored-By: Claude Opus 5.5 <noreply@anthropic.com>
</commit_message>
<xml_diff>
--- a/docs/Spatial_Transcriptomics_Visium_HD_Pipeline/modules/Portal_Content.docx
+++ b/docs/Spatial_Transcriptomics_Visium_HD_Pipeline/modules/Portal_Content.docx
@@ -4257,7 +4257,7 @@
       <w:r>
         <w:drawing>
           <wp:inline distT="0" distB="0" distL="0" distR="0">
-            <wp:extent cx="5715000" cy="2362200"/>
+            <wp:extent cx="5715000" cy="1790700"/>
             <wp:effectExtent t="0" r="0" b="0" l="0"/>
             <wp:docPr id="1" name="" descr="" title=""/>
             <wp:cNvGraphicFramePr>
@@ -4282,7 +4282,7 @@
                   <pic:spPr bwMode="auto">
                     <a:xfrm>
                       <a:off x="0" y="0"/>
-                      <a:ext cx="5715000" cy="2362200"/>
+                      <a:ext cx="5715000" cy="1790700"/>
                     </a:xfrm>
                     <a:prstGeom prst="rect">
                       <a:avLst/>
@@ -9429,7 +9429,7 @@
       <w:r>
         <w:drawing>
           <wp:inline distT="0" distB="0" distL="0" distR="0">
-            <wp:extent cx="5715000" cy="2362200"/>
+            <wp:extent cx="5715000" cy="2619375"/>
             <wp:effectExtent t="0" r="0" b="0" l="0"/>
             <wp:docPr id="3" name="" descr="" title=""/>
             <wp:cNvGraphicFramePr>
@@ -9454,7 +9454,7 @@
                   <pic:spPr bwMode="auto">
                     <a:xfrm>
                       <a:off x="0" y="0"/>
-                      <a:ext cx="5715000" cy="2362200"/>
+                      <a:ext cx="5715000" cy="2619375"/>
                     </a:xfrm>
                     <a:prstGeom prst="rect">
                       <a:avLst/>
@@ -9487,7 +9487,7 @@
         <w:t xml:space="preserve">그림. Visium HD 통합 군집과 모든 bin 배정.</w:t>
       </w:r>
       <w:r>
-        <w:t xml:space="preserve"> (A) 모든 슬라이드의 sketch bin을 합쳐 Harmony로 슬라이드 차이를 보정하고 군집, UMAP, 마커를 계산합니다. (B) 각 bin(흰 사각형)을 같은 PCA에 투영하고, 같은 슬라이드에서 가장 가까운 sketch bin k_transfer개의 다수결로 군집을 붙입니다. 같은 군집인 이웃의 비율이 Cluster_score입니다. (C) 모든 bin에 군집이 붙은 슬라이드 객체와 hd_slides.tsv를 만들며, 조건 비교, 공간 가변 유전자, RCTD 모듈의 입력이 됩니다. 값과 조직 모양은 모식적인 값입니다.</w:t>
+        <w:t xml:space="preserve"> (A) 모든 슬라이드의 sketch bin을 합쳐 Harmony로 슬라이드 차이를 보정하고 군집, UMAP, 마커를 계산합니다. (B) 각 bin(흰 사각형)을 같은 PCA에 투영하고, 같은 슬라이드에서 가장 가까운 sketch bin k_transfer개의 다수결로 군집을 붙입니다. 같은 군집인 이웃의 비율이 Cluster_score입니다. 값과 조직 모양은 모식적인 값입니다.</w:t>
       </w:r>
     </w:p>
     <w:p>
@@ -9510,7 +9510,7 @@
         <w:t xml:space="preserve">Figure. Joint Visium HD clustering and labels for every bin.</w:t>
       </w:r>
       <w:r>
-        <w:t xml:space="preserve"> (A) The sketched bins of all slides are merged, slide differences corrected with Harmony, and clusters, UMAP and markers computed. (B) Each bin (white square) is projected onto the same PCA and labelled by majority vote of its k_transfer nearest sketched bins of the same slide; the fraction of agreeing neighbours is Cluster_score. (C) Slide objects with a cluster on every bin and hd_slides.tsv are written; they are the input of the condition comparison, spatially variable gene and RCTD modules. Values and tissue shapes are schematic.</w:t>
+        <w:t xml:space="preserve"> (A) The sketched bins of all slides are merged, slide differences corrected with Harmony, and clusters, UMAP and markers computed. (B) Each bin (white square) is projected onto the same PCA and labelled by majority vote of its k_transfer nearest sketched bins of the same slide; the fraction of agreeing neighbours is Cluster_score. Values and tissue shapes are schematic.</w:t>
       </w:r>
     </w:p>
     <w:p>
@@ -13934,7 +13934,7 @@
       <w:r>
         <w:drawing>
           <wp:inline distT="0" distB="0" distL="0" distR="0">
-            <wp:extent cx="5715000" cy="2362200"/>
+            <wp:extent cx="5715000" cy="2314575"/>
             <wp:effectExtent t="0" r="0" b="0" l="0"/>
             <wp:docPr id="4" name="" descr="" title=""/>
             <wp:cNvGraphicFramePr>
@@ -13959,7 +13959,7 @@
                   <pic:spPr bwMode="auto">
                     <a:xfrm>
                       <a:off x="0" y="0"/>
-                      <a:ext cx="5715000" cy="2362200"/>
+                      <a:ext cx="5715000" cy="2314575"/>
                     </a:xfrm>
                     <a:prstGeom prst="rect">
                       <a:avLst/>
@@ -13992,7 +13992,7 @@
         <w:t xml:space="preserve">그림. Visium HD 공간 가변 유전자.</w:t>
       </w:r>
       <w:r>
-        <w:t xml:space="preserve"> (A) 슬라이드마다 bin을 max_bins개 무작위로 뽑습니다(파란 칸). Moran's I 계산량이 bin 수의 제곱으로 늘어나기 때문입니다. (B) 가변 유전자 svf_topn개마다 Moran's I와 p값, BH 보정 p값을 계산해 순위를 매깁니다. (C) 상위 유전자의 발현을 모든 bin 위에 그리고, 슬라이드별 표와 요약 표를 남깁니다. 값과 조직 모양은 모식적인 값입니다.</w:t>
+        <w:t xml:space="preserve"> (A) 슬라이드마다 bin을 max_bins개 무작위로 뽑습니다(파란 칸). Moran's I 계산량이 bin 수의 제곱으로 늘어나기 때문입니다. (B) 가변 유전자 svf_topn개마다 Moran's I와 p값, BH 보정 p값을 계산해 순위를 매깁니다. 값과 조직 모양은 모식적인 값입니다.</w:t>
       </w:r>
     </w:p>
     <w:p>
@@ -14015,7 +14015,7 @@
         <w:t xml:space="preserve">Figure. Spatially variable genes of Visium HD slides.</w:t>
       </w:r>
       <w:r>
-        <w:t xml:space="preserve"> (A) max_bins bins are sampled at random per slide (blue squares), because the cost of Moran's I grows with the square of the bin count. (B) For each of the svf_topn variable genes, Moran's I, its p-value and the BH-adjusted p-value are computed and the genes are ranked. (C) The top genes are drawn on all bins, and per-slide and summary tables are written. Values and tissue shapes are schematic.</w:t>
+        <w:t xml:space="preserve"> (A) max_bins bins are sampled at random per slide (blue squares), because the cost of Moran's I grows with the square of the bin count. (B) For each of the svf_topn variable genes, Moran's I, its p-value and the BH-adjusted p-value are computed and the genes are ranked. Values and tissue shapes are schematic.</w:t>
       </w:r>
     </w:p>
     <w:p>
@@ -19827,7 +19827,7 @@
       <w:r>
         <w:drawing>
           <wp:inline distT="0" distB="0" distL="0" distR="0">
-            <wp:extent cx="5715000" cy="2362200"/>
+            <wp:extent cx="5715000" cy="2971800"/>
             <wp:effectExtent t="0" r="0" b="0" l="0"/>
             <wp:docPr id="6" name="" descr="" title=""/>
             <wp:cNvGraphicFramePr>
@@ -19852,7 +19852,7 @@
                   <pic:spPr bwMode="auto">
                     <a:xfrm>
                       <a:off x="0" y="0"/>
-                      <a:ext cx="5715000" cy="2362200"/>
+                      <a:ext cx="5715000" cy="2971800"/>
                     </a:xfrm>
                     <a:prstGeom prst="rect">
                       <a:avLst/>
@@ -19885,7 +19885,7 @@
         <w:t xml:space="preserve">그림. 조건 간 군집별 비교.</w:t>
       </w:r>
       <w:r>
-        <w:t xml:space="preserve"> (A) 슬라이스마다 한 군집 spot의 count를 합친 pseudobulk를 만들고, 슬라이스를 반복으로 삼아 DESeq2(~ Condition, 짝 설계면 ~ Patient + Condition)로 검정합니다. 조건마다 슬라이스가 한 장뿐이면 spot 단위 Wilcoxon(탐색용)으로 비교합니다. (B) 군집마다 volcano를 그립니다(x축 log2 fold change, y축 -log10 adjusted p, 빨강 기준보다 높음, 파랑 낮음, 점선은 lfc_cutoff와 padj_cutoff). (C) de_summary.tsv에 군집별 검정 방법과 상태(ok, ok_exploratory, insufficient_slices)를 남깁니다. Visium merge 결과와 Visium HD 결과(hd_slides.tsv)를 모두 받으며, group_by로 세포 유형 열을 쓸 수도 있습니다. 값과 조직 모양은 모식적인 값입니다.</w:t>
+        <w:t xml:space="preserve"> (A) 군집마다 volcano를 그립니다(x축 log2 fold change, y축 -log10 adjusted p, 빨강 기준보다 높음, 파랑 낮음, 점선은 lfc_cutoff와 padj_cutoff). (B) de_summary.tsv에 군집별 검정 방법과 상태(ok, ok_exploratory, insufficient_slices)를 남깁니다. Visium merge 결과와 Visium HD 결과(hd_slides.tsv)를 모두 받으며, group_by로 세포 유형 열을 쓸 수도 있습니다. 값과 조직 모양은 모식적인 값입니다.</w:t>
       </w:r>
     </w:p>
     <w:p>
@@ -19908,7 +19908,7 @@
         <w:t xml:space="preserve">Figure. Comparison between conditions per cluster.</w:t>
       </w:r>
       <w:r>
-        <w:t xml:space="preserve"> (A) For each slice, the counts of one cluster's spots are summed into a pseudobulk sample, and DESeq2 (~ Condition, or ~ Patient + Condition when paired) tests the condition with slices as replicates; with one slice per condition a spot-level Wilcoxon test (exploratory) is used. (B) A volcano per cluster (x log2 fold change, y -log10 adjusted p; red higher than the reference, blue lower; dashed lines lfc_cutoff and padj_cutoff). (C) de_summary.tsv records the method and status per cluster (ok, ok_exploratory, insufficient_slices). Visium merge output and Visium HD output (hd_slides.tsv) are both accepted, and group_by may name a cell-type column. Values and tissue shapes are schematic.</w:t>
+        <w:t xml:space="preserve"> (A) A volcano per cluster (x log2 fold change, y -log10 adjusted p; red higher than the reference, blue lower; dashed lines lfc_cutoff and padj_cutoff). (B) de_summary.tsv records the method and status per cluster (ok, ok_exploratory, insufficient_slices). Visium merge output and Visium HD output (hd_slides.tsv) are both accepted, and group_by may name a cell-type column. Values and tissue shapes are schematic.</w:t>
       </w:r>
     </w:p>
     <w:p>
@@ -24931,7 +24931,7 @@
       <w:r>
         <w:drawing>
           <wp:inline distT="0" distB="0" distL="0" distR="0">
-            <wp:extent cx="5715000" cy="2362200"/>
+            <wp:extent cx="5715000" cy="2838450"/>
             <wp:effectExtent t="0" r="0" b="0" l="0"/>
             <wp:docPr id="7" name="" descr="" title=""/>
             <wp:cNvGraphicFramePr>
@@ -24956,7 +24956,7 @@
                   <pic:spPr bwMode="auto">
                     <a:xfrm>
                       <a:off x="0" y="0"/>
-                      <a:ext cx="5715000" cy="2362200"/>
+                      <a:ext cx="5715000" cy="2838450"/>
                     </a:xfrm>
                     <a:prstGeom prst="rect">
                       <a:avLst/>
@@ -24989,7 +24989,7 @@
         <w:t xml:space="preserve">그림. Visium HD bin의 세포 유형(RCTD).</w:t>
       </w:r>
       <w:r>
-        <w:t xml:space="preserve"> (A) 슬라이드의 bin을 chunk_bins개씩 나눠 단일세포 참조(raw count와 세포 유형 열)와 함께 RCTD에 넣습니다. (B) doublet 모드는 bin마다 세포 유형 하나(singlet), 둘(doublet_certain), 판정 불가(reject) 등으로 분류하고 첫째·둘째 세포 유형을 줍니다. 16µm에 쓰는 full 모드는 weight를 주고 가장 큰 weight를 첫째 세포 유형으로 씁니다. (C) 모든 bin에 세포 유형이 붙은 슬라이드 객체, weight 표, 슬라이드×세포 유형 비율을 만들고, hd_slides.tsv로 spatial_condition_de(group_by=rctd_first_type)에 넘깁니다. 값과 조직 모양은 모식적인 값입니다.</w:t>
+        <w:t xml:space="preserve"> (A) 슬라이드의 bin을 chunk_bins개씩 나눠 단일세포 참조(raw count와 세포 유형 열)와 함께 RCTD에 넣습니다. (B) doublet 모드는 bin마다 세포 유형 하나(singlet), 둘(doublet_certain), 판정 불가(reject) 등으로 분류하고 첫째·둘째 세포 유형을 줍니다. 16µm에 쓰는 full 모드는 weight를 주고 가장 큰 weight를 첫째 세포 유형으로 씁니다. 값과 조직 모양은 모식적인 값입니다.</w:t>
       </w:r>
     </w:p>
     <w:p>
@@ -25012,7 +25012,7 @@
         <w:t xml:space="preserve">Figure. Cell types of Visium HD bins with RCTD.</w:t>
       </w:r>
       <w:r>
-        <w:t xml:space="preserve"> (A) The bins of a slide are passed to RCTD in chunks of chunk_bins together with the single-cell reference (raw counts and a cell-type column). (B) doublet mode classifies each bin as one cell type (singlet), two (doublet_certain) or undecided (reject) and gives a first and second type; full mode, used for 16 um, gives weights and the highest weight is the first type. (C) Slide objects with a cell type on every bin, weight tables and slide-by-cell-type proportions are written, and hd_slides.tsv passes them to spatial_condition_de (group_by=rctd_first_type). Values and tissue shapes are schematic.</w:t>
+        <w:t xml:space="preserve"> (A) The bins of a slide are passed to RCTD in chunks of chunk_bins together with the single-cell reference (raw counts and a cell-type column). (B) doublet mode classifies each bin as one cell type (singlet), two (doublet_certain) or undecided (reject) and gives a first and second type; full mode, used for 16 um, gives weights and the highest weight is the first type. Values and tissue shapes are schematic.</w:t>
       </w:r>
     </w:p>
     <w:p>
@@ -28373,7 +28373,7 @@
       <w:r>
         <w:drawing>
           <wp:inline distT="0" distB="0" distL="0" distR="0">
-            <wp:extent cx="5715000" cy="2362200"/>
+            <wp:extent cx="5715000" cy="2628900"/>
             <wp:effectExtent t="0" r="0" b="0" l="0"/>
             <wp:docPr id="8" name="" descr="" title=""/>
             <wp:cNvGraphicFramePr>
@@ -28398,7 +28398,7 @@
                   <pic:spPr bwMode="auto">
                     <a:xfrm>
                       <a:off x="0" y="0"/>
-                      <a:ext cx="5715000" cy="2362200"/>
+                      <a:ext cx="5715000" cy="2628900"/>
                     </a:xfrm>
                     <a:prstGeom prst="rect">
                       <a:avLst/>
@@ -28431,7 +28431,7 @@
         <w:t xml:space="preserve">그림. 단일세포 참조 자료의 세포 유형 열 확인.</w:t>
       </w:r>
       <w:r>
-        <w:t xml:space="preserve"> (A) 참조 자료는 세포마다 메타데이터(세포 유형, 배치, UMI 수 등)를 가진 Seurat 객체입니다. (B) 열마다 형식과 범주 수, 가장 많은 값을 로그에 적고, 범주가 2~100개인 범주형 열에 [CELLTYPE?]를 붙입니다. 숫자형 열과 범주가 너무 많은 열은 후보에서 뺍니다(SKIP). (C) reference_columns.tsv에서 후보를 보고 세포 유형 열을 골라 spatial_labelTransfer, spatial_rctd, spatial_hd_rctd의 reference_label_col에 넣습니다. 값은 모식적인 값입니다.</w:t>
+        <w:t xml:space="preserve"> (A) 열마다 형식과 범주 수, 가장 많은 값을 로그에 적고, 범주가 2~100개인 범주형 열에 [CELLTYPE?]를 붙입니다. 숫자형 열과 범주가 너무 많은 열은 후보에서 뺍니다(SKIP). (B) reference_columns.tsv에서 후보를 보고 세포 유형 열을 골라 spatial_labelTransfer, spatial_rctd, spatial_hd_rctd의 reference_label_col에 넣습니다. 값은 모식적인 값입니다.</w:t>
       </w:r>
     </w:p>
     <w:p>
@@ -28454,7 +28454,7 @@
         <w:t xml:space="preserve">Figure. Checking the cell-type column of a single-cell reference.</w:t>
       </w:r>
       <w:r>
-        <w:t xml:space="preserve"> (A) The reference is a Seurat object with per-cell metadata (cell type, batch, UMI counts and so on). (B) For each column the log lists its type, number of categories and most frequent values; categorical columns with 2-100 categories are tagged [CELLTYPE?], while numeric columns and columns with too many categories are skipped. (C) The cell-type column is chosen from the candidates in reference_columns.tsv and given as reference_label_col to spatial_labelTransfer, spatial_rctd and spatial_hd_rctd. Values are schematic.</w:t>
+        <w:t xml:space="preserve"> (A) For each column the log lists its type, number of categories and most frequent values; categorical columns with 2-100 categories are tagged [CELLTYPE?], while numeric columns and columns with too many categories are skipped. (B) The cell-type column is chosen from the candidates in reference_columns.tsv and given as reference_label_col to spatial_labelTransfer, spatial_rctd and spatial_hd_rctd. Values are schematic.</w:t>
       </w:r>
     </w:p>
     <w:p>

</xml_diff>

<commit_message>
Spatial HD: hd_rctd results from the CLOSHA colorectal run; spatial_hd_svf 1.1 picks the top genes by Moran's I
Co-Authored-By: Claude Opus 5.5 <noreply@anthropic.com>
</commit_message>
<xml_diff>
--- a/docs/Spatial_Transcriptomics_Visium_HD_Pipeline/modules/Portal_Content.docx
+++ b/docs/Spatial_Transcriptomics_Visium_HD_Pipeline/modules/Portal_Content.docx
@@ -11120,7 +11120,7 @@
                 <w:sz w:val="18"/>
                 <w:szCs w:val="18"/>
               </w:rPr>
-              <w:t xml:space="preserve">spatial_hd_svf.1.0.R</w:t>
+              <w:t xml:space="preserve">spatial_hd_svf.1.1.R</w:t>
             </w:r>
           </w:p>
         </w:tc>
@@ -11201,6 +11201,45 @@
       </w:tr>
     </w:tbl>
     <w:p/>
+    <w:p>
+      <w:pPr>
+        <w:spacing w:after="120"/>
+      </w:pPr>
+      <w:r>
+        <w:rPr>
+          <w:b/>
+          <w:bCs/>
+          <w:color w:val="B0B0B0"/>
+          <w:sz w:val="18"/>
+          <w:szCs w:val="18"/>
+        </w:rPr>
+        <w:t xml:space="preserve">[내부 메모 · 붙여 넣지 마세요] </w:t>
+      </w:r>
+      <w:r>
+        <w:rPr>
+          <w:color w:val="8A8F99"/>
+          <w:sz w:val="18"/>
+          <w:szCs w:val="18"/>
+        </w:rPr>
+        <w:t xml:space="preserve">등록 메모: 작업 파일 </w:t>
+      </w:r>
+      <w:r>
+        <w:rPr>
+          <w:color w:val="8A8F99"/>
+          <w:sz w:val="18"/>
+          <w:szCs w:val="18"/>
+        </w:rPr>
+        <w:t xml:space="preserve">spatial_hd_svf.1.1.R</w:t>
+      </w:r>
+      <w:r>
+        <w:rPr>
+          <w:color w:val="8A8F99"/>
+          <w:sz w:val="18"/>
+          <w:szCs w:val="18"/>
+        </w:rPr>
+        <w:t xml:space="preserve">을 배포 번호 1.0으로 올립니다.</w:t>
+      </w:r>
+    </w:p>
     <w:p>
       <w:pPr>
         <w:spacing w:after="100" w:before="200"/>
@@ -14375,7 +14414,7 @@
           <w:sz w:val="19"/>
           <w:szCs w:val="19"/>
         </w:rPr>
-        <w:t xml:space="preserve">Rscript spatial_hd_svf.1.0.R \</w:t>
+        <w:t xml:space="preserve">Rscript spatial_hd_svf.1.1.R \</w:t>
       </w:r>
     </w:p>
     <w:p>
@@ -25569,25 +25608,16 @@
     </w:p>
     <w:p>
       <w:pPr>
-        <w:spacing w:after="120"/>
-      </w:pPr>
-      <w:r>
-        <w:rPr>
-          <w:b/>
-          <w:bCs/>
-          <w:color w:val="B0B0B0"/>
-          <w:sz w:val="18"/>
-          <w:szCs w:val="18"/>
-        </w:rPr>
-        <w:t xml:space="preserve">[내부 메모 · 붙여 넣지 마세요] </w:t>
-      </w:r>
-      <w:r>
-        <w:rPr>
-          <w:color w:val="8A8F99"/>
-          <w:sz w:val="18"/>
-          <w:szCs w:val="18"/>
-        </w:rPr>
-        <w:t xml:space="preserve">등록 메모: CLOSHA 실행 결과로 그림과 레전드의 수치를 넣습니다. 그림 파일 이름은 아래 경로로 둡니다.</w:t>
+        <w:spacing w:after="140"/>
+      </w:pPr>
+      <w:r>
+        <w:t xml:space="preserve">CLOSHA에서 같은 연구의 단일세포 참조(</w:t>
+      </w:r>
+      <w:r>
+        <w:t xml:space="preserve">human_colon_crc_flex_300pertype.rds</w:t>
+      </w:r>
+      <w:r>
+        <w:t xml:space="preserve">, reference_label_col=Level1, 9종)와 8코어로 실행했고, 5장에 약 4시간 10분(슬라이드당 33~60분) 걸렸습니다.</w:t>
       </w:r>
     </w:p>
     <w:p>
@@ -25618,7 +25648,87 @@
         <w:t xml:space="preserve">&lt;slide&gt;/plots/&lt;slide&gt;_rctd_first_type.png</w:t>
       </w:r>
       <w:r>
-        <w:t xml:space="preserve"> (PDF도 있음)</w:t>
+        <w:t xml:space="preserve"> (PDF도 있음), 가중치 표 </w:t>
+      </w:r>
+      <w:r>
+        <w:t xml:space="preserve">&lt;slide&gt;/&lt;slide&gt;_rctd_weights.tsv.gz</w:t>
+      </w:r>
+    </w:p>
+    <w:p>
+      <w:pPr>
+        <w:spacing w:after="120"/>
+      </w:pPr>
+      <w:r>
+        <w:rPr>
+          <w:b/>
+          <w:bCs/>
+          <w:color w:val="B0B0B0"/>
+          <w:sz w:val="18"/>
+          <w:szCs w:val="18"/>
+        </w:rPr>
+        <w:t xml:space="preserve">[내부 메모 · 붙여 넣지 마세요] </w:t>
+      </w:r>
+      <w:r>
+        <w:rPr>
+          <w:color w:val="8A8F99"/>
+          <w:sz w:val="18"/>
+          <w:szCs w:val="18"/>
+        </w:rPr>
+        <w:t xml:space="preserve">그림: </w:t>
+      </w:r>
+      <w:r>
+        <w:rPr>
+          <w:color w:val="8A8F99"/>
+          <w:sz w:val="18"/>
+          <w:szCs w:val="18"/>
+        </w:rPr>
+        <w:t xml:space="preserve">docs/Spatial_Transcriptomics_Visium_HD_Pipeline/modules/figures/results/spatial_hd_rctd_result_1.png</w:t>
+      </w:r>
+    </w:p>
+    <w:p>
+      <w:pPr>
+        <w:spacing w:after="120" w:before="120"/>
+        <w:jc w:val="center"/>
+      </w:pPr>
+      <w:r>
+        <w:drawing>
+          <wp:inline distT="0" distB="0" distL="0" distR="0">
+            <wp:extent cx="5715000" cy="4648200"/>
+            <wp:effectExtent t="0" r="0" b="0" l="0"/>
+            <wp:docPr id="14" name="" descr="" title=""/>
+            <wp:cNvGraphicFramePr>
+              <a:graphicFrameLocks xmlns:a="http://schemas.openxmlformats.org/drawingml/2006/main" noChangeAspect="1"/>
+            </wp:cNvGraphicFramePr>
+            <a:graphic xmlns:a="http://schemas.openxmlformats.org/drawingml/2006/main">
+              <a:graphicData uri="http://schemas.openxmlformats.org/drawingml/2006/picture">
+                <pic:pic xmlns:pic="http://schemas.openxmlformats.org/drawingml/2006/picture">
+                  <pic:nvPicPr>
+                    <pic:cNvPr id="0" name="" descr=""/>
+                    <pic:cNvPicPr>
+                      <a:picLocks noChangeAspect="1" noChangeArrowheads="1"/>
+                    </pic:cNvPicPr>
+                  </pic:nvPicPr>
+                  <pic:blipFill>
+                    <a:blip r:embed="rId20" cstate="none"/>
+                    <a:srcRect/>
+                    <a:stretch>
+                      <a:fillRect/>
+                    </a:stretch>
+                  </pic:blipFill>
+                  <pic:spPr bwMode="auto">
+                    <a:xfrm>
+                      <a:off x="0" y="0"/>
+                      <a:ext cx="5715000" cy="4648200"/>
+                    </a:xfrm>
+                    <a:prstGeom prst="rect">
+                      <a:avLst/>
+                    </a:prstGeom>
+                  </pic:spPr>
+                </pic:pic>
+              </a:graphicData>
+            </a:graphic>
+          </wp:inline>
+        </w:drawing>
       </w:r>
     </w:p>
     <w:p>
@@ -25631,10 +25741,17 @@
         <w:spacing w:after="80"/>
       </w:pPr>
       <w:r>
-        <w:t xml:space="preserve">그림 자리: </w:t>
-      </w:r>
-      <w:r>
-        <w:t xml:space="preserve">docs/Spatial_Transcriptomics_Visium_HD_Pipeline/modules/figures/results/spatial_hd_rctd_result_1.png</w:t>
+        <w:t xml:space="preserve">레전드(국문): </w:t>
+      </w:r>
+      <w:r>
+        <w:rPr>
+          <w:b/>
+          <w:bCs/>
+        </w:rPr>
+        <w:t xml:space="preserve">bin마다 가장 비중이 큰 세포 유형(crc_p1, Level1).</w:t>
+      </w:r>
+      <w:r>
+        <w:t xml:space="preserve"> 참조는 같은 연구의 단일세포 자료입니다. 예시 데이터에서 crc_p1의 12만 6,144 bin 중 10만 7,470개(85%)가 점수를 받았습니다. 아래쪽 종양 덩어리는 Tumor, 그 사이를 가르는 기질은 Fibroblast, 왼쪽 정상 점막은 Intestinal Epithelial, 오른쪽 위 근육층은 Smooth Muscle로 칠해지고, 가운데에 T cells와 B cells가 모인 면역 영역이 보입니다. UMI가 umi_min보다 적어 점수를 매기지 않은 bin은 NA(회색)입니다.</w:t>
       </w:r>
     </w:p>
     <w:p>
@@ -25647,17 +25764,29 @@
         <w:spacing w:after="80"/>
       </w:pPr>
       <w:r>
-        <w:t xml:space="preserve">레전드(국문): </w:t>
+        <w:t xml:space="preserve">레전드(영문): </w:t>
       </w:r>
       <w:r>
         <w:rPr>
           <w:b/>
           <w:bCs/>
         </w:rPr>
-        <w:t xml:space="preserve">bin마다 가장 비중이 큰 세포 유형(Level1).</w:t>
-      </w:r>
-      <w:r>
-        <w:t xml:space="preserve"> 참조는 같은 연구의 단일세포 자료입니다. 종양 영역은 Tumor, 근육층은 Smooth Muscle, 그 사이에 Fibroblast와 면역세포(T cells, B cells, Myeloid)가 칠해집니다. UMI가 umi_min보다 적은 bin은 NA입니다.</w:t>
+        <w:t xml:space="preserve">The cell type with the largest weight in each bin (crc_p1, Level1).</w:t>
+      </w:r>
+      <w:r>
+        <w:t xml:space="preserve"> The reference is single-cell data from the same study. In the example data 107,470 of the 126,144 bins of crc_p1 (85%) were scored. The tumour masses at the bottom show Tumor, the stroma dividing them Fibroblast, the normal mucosa on the left Intestinal Epithelial and the muscle layer at the upper right Smooth Muscle, with an immune area of T cells and B cells in the middle. Bins below umi_min are not scored and shown as NA (grey).</w:t>
+      </w:r>
+    </w:p>
+    <w:p>
+      <w:pPr>
+        <w:spacing w:after="140"/>
+      </w:pPr>
+      <w:r>
+        <w:rPr>
+          <w:b/>
+          <w:bCs/>
+        </w:rPr>
+        <w:t xml:space="preserve">결과 2. 슬라이드별 세포 유형 구성</w:t>
       </w:r>
     </w:p>
     <w:p>
@@ -25670,29 +25799,99 @@
         <w:spacing w:after="80"/>
       </w:pPr>
       <w:r>
-        <w:t xml:space="preserve">레전드(영문): </w:t>
-      </w:r>
+        <w:t xml:space="preserve">결과 파일: </w:t>
+      </w:r>
+      <w:r>
+        <w:t xml:space="preserve">plots/celltype_by_slide.png</w:t>
+      </w:r>
+      <w:r>
+        <w:t xml:space="preserve">, 표 </w:t>
+      </w:r>
+      <w:r>
+        <w:t xml:space="preserve">celltype_by_slide.tsv</w:t>
+      </w:r>
+      <w:r>
+        <w:t xml:space="preserve">, </w:t>
+      </w:r>
+      <w:r>
+        <w:t xml:space="preserve">rctd_summary.tsv</w:t>
+      </w:r>
+    </w:p>
+    <w:p>
+      <w:pPr>
+        <w:spacing w:after="120"/>
+      </w:pPr>
       <w:r>
         <w:rPr>
           <w:b/>
           <w:bCs/>
-        </w:rPr>
-        <w:t xml:space="preserve">The cell type with the largest weight in each bin (Level1).</w:t>
-      </w:r>
-      <w:r>
-        <w:t xml:space="preserve"> The reference is single-cell data from the same study. Tumour areas show Tumor, muscle layers Smooth Muscle, with Fibroblast and immune cells (T cells, B cells, Myeloid) between them. Bins below umi_min are NA.</w:t>
-      </w:r>
-    </w:p>
-    <w:p>
-      <w:pPr>
-        <w:spacing w:after="140"/>
-      </w:pPr>
-      <w:r>
-        <w:rPr>
-          <w:b/>
-          <w:bCs/>
-        </w:rPr>
-        <w:t xml:space="preserve">결과 2. 슬라이드별 세포 유형 구성</w:t>
+          <w:color w:val="B0B0B0"/>
+          <w:sz w:val="18"/>
+          <w:szCs w:val="18"/>
+        </w:rPr>
+        <w:t xml:space="preserve">[내부 메모 · 붙여 넣지 마세요] </w:t>
+      </w:r>
+      <w:r>
+        <w:rPr>
+          <w:color w:val="8A8F99"/>
+          <w:sz w:val="18"/>
+          <w:szCs w:val="18"/>
+        </w:rPr>
+        <w:t xml:space="preserve">그림: </w:t>
+      </w:r>
+      <w:r>
+        <w:rPr>
+          <w:color w:val="8A8F99"/>
+          <w:sz w:val="18"/>
+          <w:szCs w:val="18"/>
+        </w:rPr>
+        <w:t xml:space="preserve">docs/Spatial_Transcriptomics_Visium_HD_Pipeline/modules/figures/results/spatial_hd_rctd_result_2.png</w:t>
+      </w:r>
+    </w:p>
+    <w:p>
+      <w:pPr>
+        <w:spacing w:after="120" w:before="120"/>
+        <w:jc w:val="center"/>
+      </w:pPr>
+      <w:r>
+        <w:drawing>
+          <wp:inline distT="0" distB="0" distL="0" distR="0">
+            <wp:extent cx="5715000" cy="4086225"/>
+            <wp:effectExtent t="0" r="0" b="0" l="0"/>
+            <wp:docPr id="15" name="" descr="" title=""/>
+            <wp:cNvGraphicFramePr>
+              <a:graphicFrameLocks xmlns:a="http://schemas.openxmlformats.org/drawingml/2006/main" noChangeAspect="1"/>
+            </wp:cNvGraphicFramePr>
+            <a:graphic xmlns:a="http://schemas.openxmlformats.org/drawingml/2006/main">
+              <a:graphicData uri="http://schemas.openxmlformats.org/drawingml/2006/picture">
+                <pic:pic xmlns:pic="http://schemas.openxmlformats.org/drawingml/2006/picture">
+                  <pic:nvPicPr>
+                    <pic:cNvPr id="0" name="" descr=""/>
+                    <pic:cNvPicPr>
+                      <a:picLocks noChangeAspect="1" noChangeArrowheads="1"/>
+                    </pic:cNvPicPr>
+                  </pic:nvPicPr>
+                  <pic:blipFill>
+                    <a:blip r:embed="rId21" cstate="none"/>
+                    <a:srcRect/>
+                    <a:stretch>
+                      <a:fillRect/>
+                    </a:stretch>
+                  </pic:blipFill>
+                  <pic:spPr bwMode="auto">
+                    <a:xfrm>
+                      <a:off x="0" y="0"/>
+                      <a:ext cx="5715000" cy="4086225"/>
+                    </a:xfrm>
+                    <a:prstGeom prst="rect">
+                      <a:avLst/>
+                    </a:prstGeom>
+                  </pic:spPr>
+                </pic:pic>
+              </a:graphicData>
+            </a:graphic>
+          </wp:inline>
+        </w:drawing>
       </w:r>
     </w:p>
     <w:p>
@@ -25705,22 +25904,17 @@
         <w:spacing w:after="80"/>
       </w:pPr>
       <w:r>
-        <w:t xml:space="preserve">결과 파일: </w:t>
-      </w:r>
-      <w:r>
-        <w:t xml:space="preserve">plots/celltype_by_slide.png</w:t>
-      </w:r>
-      <w:r>
-        <w:t xml:space="preserve">, 표 </w:t>
-      </w:r>
-      <w:r>
-        <w:t xml:space="preserve">celltype_by_slide.tsv</w:t>
-      </w:r>
-      <w:r>
-        <w:t xml:space="preserve">, </w:t>
-      </w:r>
-      <w:r>
-        <w:t xml:space="preserve">rctd_summary.tsv</w:t>
+        <w:t xml:space="preserve">레전드(국문): </w:t>
+      </w:r>
+      <w:r>
+        <w:rPr>
+          <w:b/>
+          <w:bCs/>
+        </w:rPr>
+        <w:t xml:space="preserve">슬라이드마다 세포 유형이 차지하는 bin 비율(점수 받은 bin 기준).</w:t>
+      </w:r>
+      <w:r>
+        <w:t xml:space="preserve"> 종양 슬라이드는 Tumor, 정상 슬라이드는 Intestinal Epithelial 비율이 높아야 합니다. 예시 데이터에서 Tumor는 종양 슬라이드 bin의 26~50%였고 정상 슬라이드에서는 0.6~1.5%였습니다. normal_p5는 Intestinal Epithelial이 49%, normal_p3는 Smooth Muscle이 37%로 가장 많았습니다. normal_p3는 UMI가 낮아(spatial_hd_prep 결과 2) 점수 받은 bin이 54%에 그쳤습니다. 이 결과를 spatial_condition_de(group_by=rctd_first_type)에 넣으면 세포 유형별로 종양과 정상을 비교합니다.</w:t>
       </w:r>
     </w:p>
     <w:p>
@@ -25733,56 +25927,17 @@
         <w:spacing w:after="80"/>
       </w:pPr>
       <w:r>
-        <w:t xml:space="preserve">그림 자리: </w:t>
-      </w:r>
-      <w:r>
-        <w:t xml:space="preserve">docs/Spatial_Transcriptomics_Visium_HD_Pipeline/modules/figures/results/spatial_hd_rctd_result_2.png</w:t>
-      </w:r>
-    </w:p>
-    <w:p>
-      <w:pPr>
-        <w:pStyle w:val="ListParagraph"/>
-        <w:numPr>
-          <w:ilvl w:val="0"/>
-          <w:numId w:val="2"/>
-        </w:numPr>
-        <w:spacing w:after="80"/>
-      </w:pPr>
-      <w:r>
-        <w:t xml:space="preserve">레전드(국문): </w:t>
+        <w:t xml:space="preserve">레전드(영문): </w:t>
       </w:r>
       <w:r>
         <w:rPr>
           <w:b/>
           <w:bCs/>
         </w:rPr>
-        <w:t xml:space="preserve">슬라이드마다 세포 유형이 차지하는 bin 비율.</w:t>
-      </w:r>
-      <w:r>
-        <w:t xml:space="preserve"> 종양 슬라이드는 Tumor, 정상 슬라이드는 Intestinal Epithelial 비율이 높아야 합니다. 이 결과를 spatial_condition_de(group_by=rctd_first_type)에 넣으면 세포 유형별로 종양과 정상을 비교합니다.</w:t>
-      </w:r>
-    </w:p>
-    <w:p>
-      <w:pPr>
-        <w:pStyle w:val="ListParagraph"/>
-        <w:numPr>
-          <w:ilvl w:val="0"/>
-          <w:numId w:val="2"/>
-        </w:numPr>
-        <w:spacing w:after="80"/>
-      </w:pPr>
-      <w:r>
-        <w:t xml:space="preserve">레전드(영문): </w:t>
-      </w:r>
-      <w:r>
-        <w:rPr>
-          <w:b/>
-          <w:bCs/>
-        </w:rPr>
-        <w:t xml:space="preserve">Fraction of bins per cell type in each slide.</w:t>
-      </w:r>
-      <w:r>
-        <w:t xml:space="preserve"> Tumour slides should be rich in Tumor and normal slides in Intestinal Epithelial. Given to spatial_condition_de (group_by=rctd_first_type), this output compares tumour and normal per cell type.</w:t>
+        <w:t xml:space="preserve">Fraction of bins per cell type in each slide (scored bins).</w:t>
+      </w:r>
+      <w:r>
+        <w:t xml:space="preserve"> Tumour slides should be rich in Tumor and normal slides in Intestinal Epithelial. In the example data Tumor made up 26-50% of the bins of the tumour slides and 0.6-1.5% of the normal slides; Intestinal Epithelial was the largest type in normal_p5 (49%) and Smooth Muscle in normal_p3 (37%). normal_p3 had low UMI counts (spatial_hd_prep result 2), so only 54% of its bins were scored. Given to spatial_condition_de (group_by=rctd_first_type), this output compares tumour and normal per cell type.</w:t>
       </w:r>
     </w:p>
     <w:p>
@@ -28693,7 +28848,7 @@
           <wp:inline distT="0" distB="0" distL="0" distR="0">
             <wp:extent cx="5715000" cy="2628900"/>
             <wp:effectExtent t="0" r="0" b="0" l="0"/>
-            <wp:docPr id="14" name="" descr="" title=""/>
+            <wp:docPr id="16" name="" descr="" title=""/>
             <wp:cNvGraphicFramePr>
               <a:graphicFrameLocks xmlns:a="http://schemas.openxmlformats.org/drawingml/2006/main" noChangeAspect="1"/>
             </wp:cNvGraphicFramePr>
@@ -28707,7 +28862,7 @@
                     </pic:cNvPicPr>
                   </pic:nvPicPr>
                   <pic:blipFill>
-                    <a:blip r:embed="rId20" cstate="none"/>
+                    <a:blip r:embed="rId22" cstate="none"/>
                     <a:srcRect/>
                     <a:stretch>
                       <a:fillRect/>

</xml_diff>

<commit_message>
Spatial HD: no figure slot for check_reference; CLOSHA run times in the resource table
Co-Authored-By: Claude Opus 5.5 <noreply@anthropic.com>
</commit_message>
<xml_diff>
--- a/docs/Spatial_Transcriptomics_Visium_HD_Pipeline/modules/Portal_Content.docx
+++ b/docs/Spatial_Transcriptomics_Visium_HD_Pipeline/modules/Portal_Content.docx
@@ -29026,29 +29026,6 @@
     </w:p>
     <w:p>
       <w:pPr>
-        <w:spacing w:after="120"/>
-      </w:pPr>
-      <w:r>
-        <w:rPr>
-          <w:b/>
-          <w:bCs/>
-          <w:color w:val="B0B0B0"/>
-          <w:sz w:val="18"/>
-          <w:szCs w:val="18"/>
-        </w:rPr>
-        <w:t xml:space="preserve">[내부 메모 · 붙여 넣지 마세요] </w:t>
-      </w:r>
-      <w:r>
-        <w:rPr>
-          <w:color w:val="8A8F99"/>
-          <w:sz w:val="18"/>
-          <w:szCs w:val="18"/>
-        </w:rPr>
-        <w:t xml:space="preserve">등록 메모: CLOSHA 실행 결과로 그림을 넣습니다.</w:t>
-      </w:r>
-    </w:p>
-    <w:p>
-      <w:pPr>
         <w:spacing w:after="140"/>
       </w:pPr>
       <w:r>
@@ -29080,21 +29057,8 @@
       <w:r>
         <w:t xml:space="preserve">logs/&lt;stamp&gt;.log</w:t>
       </w:r>
-    </w:p>
-    <w:p>
-      <w:pPr>
-        <w:pStyle w:val="ListParagraph"/>
-        <w:numPr>
-          <w:ilvl w:val="0"/>
-          <w:numId w:val="2"/>
-        </w:numPr>
-        <w:spacing w:after="80"/>
-      </w:pPr>
-      <w:r>
-        <w:t xml:space="preserve">그림 자리: </w:t>
-      </w:r>
-      <w:r>
-        <w:t xml:space="preserve">docs/Spatial_Transcriptomics_Visium_HD_Pipeline/modules/figures/results/check_reference_result_1.png</w:t>
+      <w:r>
+        <w:t xml:space="preserve"> (이 모듈은 그림을 만들지 않습니다)</w:t>
       </w:r>
     </w:p>
     <w:p>

</xml_diff>